<commit_message>
Author and teacher names, remove old draft ignores
</commit_message>
<xml_diff>
--- a/report/static_site_report.docx
+++ b/report/static_site_report.docx
@@ -98,23 +98,18 @@
         <w:rPr>
           <w:sz w:val="26"/>
         </w:rPr>
-        <w:t>Выполнил: студент ____________</w:t>
+        <w:t>Выполнил: студент группы Р4209</w:t>
       </w:r>
       <w:r>
         <w:rPr>
           <w:sz w:val="26"/>
         </w:rPr>
         <w:br/>
-      </w:r>
-      <w:r>
-        <w:rPr>
-          <w:sz w:val="22"/>
-        </w:rPr>
-        <w:t>(логин Helios s335989, GitHub ExcaliBBur)</w:t>
-      </w:r>
-      <w:r>
-        <w:rPr>
-          <w:sz w:val="22"/>
+        <w:t>Павлов Александр Сергеевич</w:t>
+      </w:r>
+      <w:r>
+        <w:rPr>
+          <w:sz w:val="26"/>
         </w:rPr>
         <w:br/>
       </w:r>
@@ -122,7 +117,15 @@
         <w:rPr>
           <w:sz w:val="26"/>
         </w:rPr>
-        <w:t>Преподаватель: ____________</w:t>
+        <w:br/>
+        <w:t>Преподаватель:</w:t>
+      </w:r>
+      <w:r>
+        <w:rPr>
+          <w:sz w:val="26"/>
+        </w:rPr>
+        <w:br/>
+        <w:t>Жуков Николай Николаевич</w:t>
       </w:r>
     </w:p>
     <w:p>
@@ -134,13 +137,13 @@
         <w:rPr>
           <w:sz w:val="26"/>
         </w:rPr>
-        <w:t>Санкт-Петербу</w:t>
+        <w:t>Санкт-Петербург</w:t>
       </w:r>
       <w:r>
         <w:rPr>
           <w:sz w:val="26"/>
         </w:rPr>
-        <w:t>рг, 2026</w:t>
+        <w:t>, 2026</w:t>
       </w:r>
     </w:p>
     <w:p>
@@ -180,7 +183,7 @@
       <w:r>
         <w:fldChar w:fldCharType="separate"/>
       </w:r>
-      <w:hyperlink w:anchor="_Toc241607299" w:history="1">
+      <w:hyperlink w:anchor="_Toc241608320" w:history="1">
         <w:r>
           <w:rPr>
             <w:rStyle w:val="aff8"/>
@@ -208,7 +211,7 @@
             <w:noProof/>
             <w:webHidden/>
           </w:rPr>
-          <w:instrText xml:space="preserve"> PAGEREF _Toc241607299 \h </w:instrText>
+          <w:instrText xml:space="preserve"> PAGEREF _Toc241608320 \h </w:instrText>
         </w:r>
         <w:r>
           <w:rPr>
@@ -249,7 +252,7 @@
           <w:noProof/>
         </w:rPr>
       </w:pPr>
-      <w:hyperlink w:anchor="_Toc241607300" w:history="1">
+      <w:hyperlink w:anchor="_Toc241608321" w:history="1">
         <w:r>
           <w:rPr>
             <w:rStyle w:val="aff8"/>
@@ -277,7 +280,7 @@
             <w:noProof/>
             <w:webHidden/>
           </w:rPr>
-          <w:instrText xml:space="preserve"> PAGEREF _Toc241607300 \h </w:instrText>
+          <w:instrText xml:space="preserve"> PAGEREF _Toc241608321 \h </w:instrText>
         </w:r>
         <w:r>
           <w:rPr>
@@ -318,7 +321,7 @@
           <w:noProof/>
         </w:rPr>
       </w:pPr>
-      <w:hyperlink w:anchor="_Toc241607301" w:history="1">
+      <w:hyperlink w:anchor="_Toc241608322" w:history="1">
         <w:r>
           <w:rPr>
             <w:rStyle w:val="aff8"/>
@@ -346,7 +349,7 @@
             <w:noProof/>
             <w:webHidden/>
           </w:rPr>
-          <w:instrText xml:space="preserve"> PAGEREF _Toc241607301 \h </w:instrText>
+          <w:instrText xml:space="preserve"> PAGEREF _Toc241608322 \h </w:instrText>
         </w:r>
         <w:r>
           <w:rPr>
@@ -387,7 +390,7 @@
           <w:noProof/>
         </w:rPr>
       </w:pPr>
-      <w:hyperlink w:anchor="_Toc241607302" w:history="1">
+      <w:hyperlink w:anchor="_Toc241608323" w:history="1">
         <w:r>
           <w:rPr>
             <w:rStyle w:val="aff8"/>
@@ -415,7 +418,7 @@
             <w:noProof/>
             <w:webHidden/>
           </w:rPr>
-          <w:instrText xml:space="preserve"> PAGEREF _Toc241607302 \h </w:instrText>
+          <w:instrText xml:space="preserve"> PAGEREF _Toc241608323 \h </w:instrText>
         </w:r>
         <w:r>
           <w:rPr>
@@ -456,7 +459,7 @@
           <w:noProof/>
         </w:rPr>
       </w:pPr>
-      <w:hyperlink w:anchor="_Toc241607303" w:history="1">
+      <w:hyperlink w:anchor="_Toc241608324" w:history="1">
         <w:r>
           <w:rPr>
             <w:rStyle w:val="aff8"/>
@@ -484,7 +487,7 @@
             <w:noProof/>
             <w:webHidden/>
           </w:rPr>
-          <w:instrText xml:space="preserve"> PAGEREF _Toc241607303 \h </w:instrText>
+          <w:instrText xml:space="preserve"> PAGEREF _Toc241608324 \h </w:instrText>
         </w:r>
         <w:r>
           <w:rPr>
@@ -525,7 +528,7 @@
           <w:noProof/>
         </w:rPr>
       </w:pPr>
-      <w:hyperlink w:anchor="_Toc241607304" w:history="1">
+      <w:hyperlink w:anchor="_Toc241608325" w:history="1">
         <w:r>
           <w:rPr>
             <w:rStyle w:val="aff8"/>
@@ -553,7 +556,7 @@
             <w:noProof/>
             <w:webHidden/>
           </w:rPr>
-          <w:instrText xml:space="preserve"> PAGEREF _Toc241607304 \h </w:instrText>
+          <w:instrText xml:space="preserve"> PAGEREF _Toc241608325 \h </w:instrText>
         </w:r>
         <w:r>
           <w:rPr>
@@ -594,7 +597,7 @@
           <w:noProof/>
         </w:rPr>
       </w:pPr>
-      <w:hyperlink w:anchor="_Toc241607305" w:history="1">
+      <w:hyperlink w:anchor="_Toc241608326" w:history="1">
         <w:r>
           <w:rPr>
             <w:rStyle w:val="aff8"/>
@@ -622,7 +625,7 @@
             <w:noProof/>
             <w:webHidden/>
           </w:rPr>
-          <w:instrText xml:space="preserve"> PAGEREF _Toc241607305 \h </w:instrText>
+          <w:instrText xml:space="preserve"> PAGEREF _Toc241608326 \h </w:instrText>
         </w:r>
         <w:r>
           <w:rPr>
@@ -663,7 +666,7 @@
           <w:noProof/>
         </w:rPr>
       </w:pPr>
-      <w:hyperlink w:anchor="_Toc241607306" w:history="1">
+      <w:hyperlink w:anchor="_Toc241608327" w:history="1">
         <w:r>
           <w:rPr>
             <w:rStyle w:val="aff8"/>
@@ -691,7 +694,7 @@
             <w:noProof/>
             <w:webHidden/>
           </w:rPr>
-          <w:instrText xml:space="preserve"> PAGEREF _Toc241607306 \h </w:instrText>
+          <w:instrText xml:space="preserve"> PAGEREF _Toc241608327 \h </w:instrText>
         </w:r>
         <w:r>
           <w:rPr>
@@ -732,7 +735,7 @@
           <w:noProof/>
         </w:rPr>
       </w:pPr>
-      <w:hyperlink w:anchor="_Toc241607307" w:history="1">
+      <w:hyperlink w:anchor="_Toc241608328" w:history="1">
         <w:r>
           <w:rPr>
             <w:rStyle w:val="aff8"/>
@@ -760,7 +763,7 @@
             <w:noProof/>
             <w:webHidden/>
           </w:rPr>
-          <w:instrText xml:space="preserve"> PAGEREF _Toc241607307 \h </w:instrText>
+          <w:instrText xml:space="preserve"> PAGEREF _Toc241608328 \h </w:instrText>
         </w:r>
         <w:r>
           <w:rPr>
@@ -801,7 +804,7 @@
           <w:noProof/>
         </w:rPr>
       </w:pPr>
-      <w:hyperlink w:anchor="_Toc241607308" w:history="1">
+      <w:hyperlink w:anchor="_Toc241608329" w:history="1">
         <w:r>
           <w:rPr>
             <w:rStyle w:val="aff8"/>
@@ -829,7 +832,7 @@
             <w:noProof/>
             <w:webHidden/>
           </w:rPr>
-          <w:instrText xml:space="preserve"> PAGEREF _Toc241607308 \h </w:instrText>
+          <w:instrText xml:space="preserve"> PAGEREF _Toc241608329 \h </w:instrText>
         </w:r>
         <w:r>
           <w:rPr>
@@ -870,7 +873,7 @@
           <w:noProof/>
         </w:rPr>
       </w:pPr>
-      <w:hyperlink w:anchor="_Toc241607309" w:history="1">
+      <w:hyperlink w:anchor="_Toc241608330" w:history="1">
         <w:r>
           <w:rPr>
             <w:rStyle w:val="aff8"/>
@@ -898,7 +901,7 @@
             <w:noProof/>
             <w:webHidden/>
           </w:rPr>
-          <w:instrText xml:space="preserve"> PAGEREF _Toc241607309 \h </w:instrText>
+          <w:instrText xml:space="preserve"> PAGEREF _Toc241608330 \h </w:instrText>
         </w:r>
         <w:r>
           <w:rPr>
@@ -939,7 +942,7 @@
           <w:noProof/>
         </w:rPr>
       </w:pPr>
-      <w:hyperlink w:anchor="_Toc241607310" w:history="1">
+      <w:hyperlink w:anchor="_Toc241608331" w:history="1">
         <w:r>
           <w:rPr>
             <w:rStyle w:val="aff8"/>
@@ -967,7 +970,7 @@
             <w:noProof/>
             <w:webHidden/>
           </w:rPr>
-          <w:instrText xml:space="preserve"> PAGEREF _Toc241607310 \h </w:instrText>
+          <w:instrText xml:space="preserve"> PAGEREF _Toc241608331 \h </w:instrText>
         </w:r>
         <w:r>
           <w:rPr>
@@ -1008,7 +1011,7 @@
           <w:noProof/>
         </w:rPr>
       </w:pPr>
-      <w:hyperlink w:anchor="_Toc241607311" w:history="1">
+      <w:hyperlink w:anchor="_Toc241608332" w:history="1">
         <w:r>
           <w:rPr>
             <w:rStyle w:val="aff8"/>
@@ -1036,7 +1039,7 @@
             <w:noProof/>
             <w:webHidden/>
           </w:rPr>
-          <w:instrText xml:space="preserve"> PAGEREF _Toc241607311 \h </w:instrText>
+          <w:instrText xml:space="preserve"> PAGEREF _Toc241608332 \h </w:instrText>
         </w:r>
         <w:r>
           <w:rPr>
@@ -1077,7 +1080,7 @@
           <w:noProof/>
         </w:rPr>
       </w:pPr>
-      <w:hyperlink w:anchor="_Toc241607312" w:history="1">
+      <w:hyperlink w:anchor="_Toc241608333" w:history="1">
         <w:r>
           <w:rPr>
             <w:rStyle w:val="aff8"/>
@@ -1105,7 +1108,7 @@
             <w:noProof/>
             <w:webHidden/>
           </w:rPr>
-          <w:instrText xml:space="preserve"> PAGEREF _Toc241607312 \h </w:instrText>
+          <w:instrText xml:space="preserve"> PAGEREF _Toc241608333 \h </w:instrText>
         </w:r>
         <w:r>
           <w:rPr>
@@ -1146,7 +1149,7 @@
           <w:noProof/>
         </w:rPr>
       </w:pPr>
-      <w:hyperlink w:anchor="_Toc241607313" w:history="1">
+      <w:hyperlink w:anchor="_Toc241608334" w:history="1">
         <w:r>
           <w:rPr>
             <w:rStyle w:val="aff8"/>
@@ -1174,7 +1177,7 @@
             <w:noProof/>
             <w:webHidden/>
           </w:rPr>
-          <w:instrText xml:space="preserve"> PAGEREF _Toc241607313 \h </w:instrText>
+          <w:instrText xml:space="preserve"> PAGEREF _Toc241608334 \h </w:instrText>
         </w:r>
         <w:r>
           <w:rPr>
@@ -1215,7 +1218,7 @@
           <w:noProof/>
         </w:rPr>
       </w:pPr>
-      <w:hyperlink w:anchor="_Toc241607314" w:history="1">
+      <w:hyperlink w:anchor="_Toc241608335" w:history="1">
         <w:r>
           <w:rPr>
             <w:rStyle w:val="aff8"/>
@@ -1243,7 +1246,7 @@
             <w:noProof/>
             <w:webHidden/>
           </w:rPr>
-          <w:instrText xml:space="preserve"> PAGEREF _Toc241607314 \h </w:instrText>
+          <w:instrText xml:space="preserve"> PAGEREF _Toc241608335 \h </w:instrText>
         </w:r>
         <w:r>
           <w:rPr>
@@ -1284,7 +1287,7 @@
           <w:noProof/>
         </w:rPr>
       </w:pPr>
-      <w:hyperlink w:anchor="_Toc241607315" w:history="1">
+      <w:hyperlink w:anchor="_Toc241608336" w:history="1">
         <w:r>
           <w:rPr>
             <w:rStyle w:val="aff8"/>
@@ -1312,7 +1315,7 @@
             <w:noProof/>
             <w:webHidden/>
           </w:rPr>
-          <w:instrText xml:space="preserve"> PAGEREF _Toc241607315 \h </w:instrText>
+          <w:instrText xml:space="preserve"> PAGEREF _Toc241608336 \h </w:instrText>
         </w:r>
         <w:r>
           <w:rPr>
@@ -1353,7 +1356,7 @@
           <w:noProof/>
         </w:rPr>
       </w:pPr>
-      <w:hyperlink w:anchor="_Toc241607316" w:history="1">
+      <w:hyperlink w:anchor="_Toc241608337" w:history="1">
         <w:r>
           <w:rPr>
             <w:rStyle w:val="aff8"/>
@@ -1381,7 +1384,7 @@
             <w:noProof/>
             <w:webHidden/>
           </w:rPr>
-          <w:instrText xml:space="preserve"> PAGEREF _Toc241607316 \h </w:instrText>
+          <w:instrText xml:space="preserve"> PAGEREF _Toc241608337 \h </w:instrText>
         </w:r>
         <w:r>
           <w:rPr>
@@ -1422,7 +1425,7 @@
           <w:noProof/>
         </w:rPr>
       </w:pPr>
-      <w:hyperlink w:anchor="_Toc241607317" w:history="1">
+      <w:hyperlink w:anchor="_Toc241608338" w:history="1">
         <w:r>
           <w:rPr>
             <w:rStyle w:val="aff8"/>
@@ -1450,7 +1453,7 @@
             <w:noProof/>
             <w:webHidden/>
           </w:rPr>
-          <w:instrText xml:space="preserve"> PAGEREF _Toc241607317 \h </w:instrText>
+          <w:instrText xml:space="preserve"> PAGEREF _Toc241608338 \h </w:instrText>
         </w:r>
         <w:r>
           <w:rPr>
@@ -1491,7 +1494,7 @@
           <w:noProof/>
         </w:rPr>
       </w:pPr>
-      <w:hyperlink w:anchor="_Toc241607318" w:history="1">
+      <w:hyperlink w:anchor="_Toc241608339" w:history="1">
         <w:r>
           <w:rPr>
             <w:rStyle w:val="aff8"/>
@@ -1519,7 +1522,7 @@
             <w:noProof/>
             <w:webHidden/>
           </w:rPr>
-          <w:instrText xml:space="preserve"> PAGEREF _Toc241607318 \h </w:instrText>
+          <w:instrText xml:space="preserve"> PAGEREF _Toc241608339 \h </w:instrText>
         </w:r>
         <w:r>
           <w:rPr>
@@ -1560,7 +1563,7 @@
           <w:noProof/>
         </w:rPr>
       </w:pPr>
-      <w:hyperlink w:anchor="_Toc241607319" w:history="1">
+      <w:hyperlink w:anchor="_Toc241608340" w:history="1">
         <w:r>
           <w:rPr>
             <w:rStyle w:val="aff8"/>
@@ -1588,7 +1591,7 @@
             <w:noProof/>
             <w:webHidden/>
           </w:rPr>
-          <w:instrText xml:space="preserve"> PAGEREF _Toc241607319 \h </w:instrText>
+          <w:instrText xml:space="preserve"> PAGEREF _Toc241608340 \h </w:instrText>
         </w:r>
         <w:r>
           <w:rPr>
@@ -1629,7 +1632,7 @@
           <w:noProof/>
         </w:rPr>
       </w:pPr>
-      <w:hyperlink w:anchor="_Toc241607320" w:history="1">
+      <w:hyperlink w:anchor="_Toc241608341" w:history="1">
         <w:r>
           <w:rPr>
             <w:rStyle w:val="aff8"/>
@@ -1657,7 +1660,7 @@
             <w:noProof/>
             <w:webHidden/>
           </w:rPr>
-          <w:instrText xml:space="preserve"> PAGEREF _Toc241607320 \h </w:instrText>
+          <w:instrText xml:space="preserve"> PAGEREF _Toc241608341 \h </w:instrText>
         </w:r>
         <w:r>
           <w:rPr>
@@ -1698,7 +1701,7 @@
           <w:noProof/>
         </w:rPr>
       </w:pPr>
-      <w:hyperlink w:anchor="_Toc241607321" w:history="1">
+      <w:hyperlink w:anchor="_Toc241608342" w:history="1">
         <w:r>
           <w:rPr>
             <w:rStyle w:val="aff8"/>
@@ -1726,7 +1729,7 @@
             <w:noProof/>
             <w:webHidden/>
           </w:rPr>
-          <w:instrText xml:space="preserve"> PAGEREF _Toc241607321 \h </w:instrText>
+          <w:instrText xml:space="preserve"> PAGEREF _Toc241608342 \h </w:instrText>
         </w:r>
         <w:r>
           <w:rPr>
@@ -1767,7 +1770,7 @@
           <w:noProof/>
         </w:rPr>
       </w:pPr>
-      <w:hyperlink w:anchor="_Toc241607322" w:history="1">
+      <w:hyperlink w:anchor="_Toc241608343" w:history="1">
         <w:r>
           <w:rPr>
             <w:rStyle w:val="aff8"/>
@@ -1795,7 +1798,7 @@
             <w:noProof/>
             <w:webHidden/>
           </w:rPr>
-          <w:instrText xml:space="preserve"> PAGEREF _Toc241607322 \h </w:instrText>
+          <w:instrText xml:space="preserve"> PAGEREF _Toc241608343 \h </w:instrText>
         </w:r>
         <w:r>
           <w:rPr>
@@ -1836,7 +1839,7 @@
           <w:noProof/>
         </w:rPr>
       </w:pPr>
-      <w:hyperlink w:anchor="_Toc241607323" w:history="1">
+      <w:hyperlink w:anchor="_Toc241608344" w:history="1">
         <w:r>
           <w:rPr>
             <w:rStyle w:val="aff8"/>
@@ -1864,7 +1867,7 @@
             <w:noProof/>
             <w:webHidden/>
           </w:rPr>
-          <w:instrText xml:space="preserve"> PAGEREF _Toc241607323 \h </w:instrText>
+          <w:instrText xml:space="preserve"> PAGEREF _Toc241608344 \h </w:instrText>
         </w:r>
         <w:r>
           <w:rPr>
@@ -1905,7 +1908,7 @@
           <w:noProof/>
         </w:rPr>
       </w:pPr>
-      <w:hyperlink w:anchor="_Toc241607324" w:history="1">
+      <w:hyperlink w:anchor="_Toc241608345" w:history="1">
         <w:r>
           <w:rPr>
             <w:rStyle w:val="aff8"/>
@@ -1933,7 +1936,7 @@
             <w:noProof/>
             <w:webHidden/>
           </w:rPr>
-          <w:instrText xml:space="preserve"> PAGEREF _Toc241607324 \h </w:instrText>
+          <w:instrText xml:space="preserve"> PAGEREF _Toc241608345 \h </w:instrText>
         </w:r>
         <w:r>
           <w:rPr>
@@ -1974,7 +1977,7 @@
           <w:noProof/>
         </w:rPr>
       </w:pPr>
-      <w:hyperlink w:anchor="_Toc241607325" w:history="1">
+      <w:hyperlink w:anchor="_Toc241608346" w:history="1">
         <w:r>
           <w:rPr>
             <w:rStyle w:val="aff8"/>
@@ -2002,7 +2005,7 @@
             <w:noProof/>
             <w:webHidden/>
           </w:rPr>
-          <w:instrText xml:space="preserve"> PAGEREF _Toc241607325 \h </w:instrText>
+          <w:instrText xml:space="preserve"> PAGEREF _Toc241608346 \h </w:instrText>
         </w:r>
         <w:r>
           <w:rPr>
@@ -2043,7 +2046,7 @@
           <w:noProof/>
         </w:rPr>
       </w:pPr>
-      <w:hyperlink w:anchor="_Toc241607326" w:history="1">
+      <w:hyperlink w:anchor="_Toc241608347" w:history="1">
         <w:r>
           <w:rPr>
             <w:rStyle w:val="aff8"/>
@@ -2071,7 +2074,7 @@
             <w:noProof/>
             <w:webHidden/>
           </w:rPr>
-          <w:instrText xml:space="preserve"> PAGEREF _Toc241607326 \h </w:instrText>
+          <w:instrText xml:space="preserve"> PAGEREF _Toc241608347 \h </w:instrText>
         </w:r>
         <w:r>
           <w:rPr>
@@ -2112,7 +2115,7 @@
           <w:noProof/>
         </w:rPr>
       </w:pPr>
-      <w:hyperlink w:anchor="_Toc241607327" w:history="1">
+      <w:hyperlink w:anchor="_Toc241608348" w:history="1">
         <w:r>
           <w:rPr>
             <w:rStyle w:val="aff8"/>
@@ -2140,7 +2143,7 @@
             <w:noProof/>
             <w:webHidden/>
           </w:rPr>
-          <w:instrText xml:space="preserve"> PAGEREF _Toc241607327 \h </w:instrText>
+          <w:instrText xml:space="preserve"> PAGEREF _Toc241608348 \h </w:instrText>
         </w:r>
         <w:r>
           <w:rPr>
@@ -2181,7 +2184,7 @@
           <w:noProof/>
         </w:rPr>
       </w:pPr>
-      <w:hyperlink w:anchor="_Toc241607328" w:history="1">
+      <w:hyperlink w:anchor="_Toc241608349" w:history="1">
         <w:r>
           <w:rPr>
             <w:rStyle w:val="aff8"/>
@@ -2209,7 +2212,7 @@
             <w:noProof/>
             <w:webHidden/>
           </w:rPr>
-          <w:instrText xml:space="preserve"> PAGEREF _Toc241607328 \h </w:instrText>
+          <w:instrText xml:space="preserve"> PAGEREF _Toc241608349 \h </w:instrText>
         </w:r>
         <w:r>
           <w:rPr>
@@ -2250,7 +2253,7 @@
           <w:noProof/>
         </w:rPr>
       </w:pPr>
-      <w:hyperlink w:anchor="_Toc241607329" w:history="1">
+      <w:hyperlink w:anchor="_Toc241608350" w:history="1">
         <w:r>
           <w:rPr>
             <w:rStyle w:val="aff8"/>
@@ -2278,7 +2281,7 @@
             <w:noProof/>
             <w:webHidden/>
           </w:rPr>
-          <w:instrText xml:space="preserve"> PAGEREF _Toc241607329 \h </w:instrText>
+          <w:instrText xml:space="preserve"> PAGEREF _Toc241608350 \h </w:instrText>
         </w:r>
         <w:r>
           <w:rPr>
@@ -2319,7 +2322,7 @@
           <w:noProof/>
         </w:rPr>
       </w:pPr>
-      <w:hyperlink w:anchor="_Toc241607330" w:history="1">
+      <w:hyperlink w:anchor="_Toc241608351" w:history="1">
         <w:r>
           <w:rPr>
             <w:rStyle w:val="aff8"/>
@@ -2347,7 +2350,7 @@
             <w:noProof/>
             <w:webHidden/>
           </w:rPr>
-          <w:instrText xml:space="preserve"> PAGEREF _Toc241607330 \h </w:instrText>
+          <w:instrText xml:space="preserve"> PAGEREF _Toc241608351 \h </w:instrText>
         </w:r>
         <w:r>
           <w:rPr>
@@ -2388,7 +2391,7 @@
           <w:noProof/>
         </w:rPr>
       </w:pPr>
-      <w:hyperlink w:anchor="_Toc241607331" w:history="1">
+      <w:hyperlink w:anchor="_Toc241608352" w:history="1">
         <w:r>
           <w:rPr>
             <w:rStyle w:val="aff8"/>
@@ -2416,7 +2419,7 @@
             <w:noProof/>
             <w:webHidden/>
           </w:rPr>
-          <w:instrText xml:space="preserve"> PAGEREF _Toc241607331 \h </w:instrText>
+          <w:instrText xml:space="preserve"> PAGEREF _Toc241608352 \h </w:instrText>
         </w:r>
         <w:r>
           <w:rPr>
@@ -2457,7 +2460,7 @@
           <w:noProof/>
         </w:rPr>
       </w:pPr>
-      <w:hyperlink w:anchor="_Toc241607332" w:history="1">
+      <w:hyperlink w:anchor="_Toc241608353" w:history="1">
         <w:r>
           <w:rPr>
             <w:rStyle w:val="aff8"/>
@@ -2485,7 +2488,7 @@
             <w:noProof/>
             <w:webHidden/>
           </w:rPr>
-          <w:instrText xml:space="preserve"> PAGEREF _Toc241607332 \h </w:instrText>
+          <w:instrText xml:space="preserve"> PAGEREF _Toc241608353 \h </w:instrText>
         </w:r>
         <w:r>
           <w:rPr>
@@ -2526,7 +2529,7 @@
           <w:noProof/>
         </w:rPr>
       </w:pPr>
-      <w:hyperlink w:anchor="_Toc241607333" w:history="1">
+      <w:hyperlink w:anchor="_Toc241608354" w:history="1">
         <w:r>
           <w:rPr>
             <w:rStyle w:val="aff8"/>
@@ -2554,7 +2557,7 @@
             <w:noProof/>
             <w:webHidden/>
           </w:rPr>
-          <w:instrText xml:space="preserve"> PAGEREF _Toc241607333 \h </w:instrText>
+          <w:instrText xml:space="preserve"> PAGEREF _Toc241608354 \h </w:instrText>
         </w:r>
         <w:r>
           <w:rPr>
@@ -2595,7 +2598,7 @@
           <w:noProof/>
         </w:rPr>
       </w:pPr>
-      <w:hyperlink w:anchor="_Toc241607334" w:history="1">
+      <w:hyperlink w:anchor="_Toc241608355" w:history="1">
         <w:r>
           <w:rPr>
             <w:rStyle w:val="aff8"/>
@@ -2623,7 +2626,7 @@
             <w:noProof/>
             <w:webHidden/>
           </w:rPr>
-          <w:instrText xml:space="preserve"> PAGEREF _Toc241607334 \h </w:instrText>
+          <w:instrText xml:space="preserve"> PAGEREF _Toc241608355 \h </w:instrText>
         </w:r>
         <w:r>
           <w:rPr>
@@ -2664,7 +2667,7 @@
           <w:noProof/>
         </w:rPr>
       </w:pPr>
-      <w:hyperlink w:anchor="_Toc241607335" w:history="1">
+      <w:hyperlink w:anchor="_Toc241608356" w:history="1">
         <w:r>
           <w:rPr>
             <w:rStyle w:val="aff8"/>
@@ -2692,7 +2695,7 @@
             <w:noProof/>
             <w:webHidden/>
           </w:rPr>
-          <w:instrText xml:space="preserve"> PAGEREF _Toc241607335 \h </w:instrText>
+          <w:instrText xml:space="preserve"> PAGEREF _Toc241608356 \h </w:instrText>
         </w:r>
         <w:r>
           <w:rPr>
@@ -2733,7 +2736,7 @@
           <w:noProof/>
         </w:rPr>
       </w:pPr>
-      <w:hyperlink w:anchor="_Toc241607336" w:history="1">
+      <w:hyperlink w:anchor="_Toc241608357" w:history="1">
         <w:r>
           <w:rPr>
             <w:rStyle w:val="aff8"/>
@@ -2761,7 +2764,7 @@
             <w:noProof/>
             <w:webHidden/>
           </w:rPr>
-          <w:instrText xml:space="preserve"> PAGEREF _Toc241607336 \h </w:instrText>
+          <w:instrText xml:space="preserve"> PAGEREF _Toc241608357 \h </w:instrText>
         </w:r>
         <w:r>
           <w:rPr>
@@ -2802,7 +2805,7 @@
           <w:noProof/>
         </w:rPr>
       </w:pPr>
-      <w:hyperlink w:anchor="_Toc241607337" w:history="1">
+      <w:hyperlink w:anchor="_Toc241608358" w:history="1">
         <w:r>
           <w:rPr>
             <w:rStyle w:val="aff8"/>
@@ -2830,7 +2833,7 @@
             <w:noProof/>
             <w:webHidden/>
           </w:rPr>
-          <w:instrText xml:space="preserve"> PAGEREF _Toc241607337 \h </w:instrText>
+          <w:instrText xml:space="preserve"> PAGEREF _Toc241608358 \h </w:instrText>
         </w:r>
         <w:r>
           <w:rPr>
@@ -2871,7 +2874,7 @@
           <w:noProof/>
         </w:rPr>
       </w:pPr>
-      <w:hyperlink w:anchor="_Toc241607338" w:history="1">
+      <w:hyperlink w:anchor="_Toc241608359" w:history="1">
         <w:r>
           <w:rPr>
             <w:rStyle w:val="aff8"/>
@@ -2899,7 +2902,7 @@
             <w:noProof/>
             <w:webHidden/>
           </w:rPr>
-          <w:instrText xml:space="preserve"> PAGEREF _Toc241607338 \h </w:instrText>
+          <w:instrText xml:space="preserve"> PAGEREF _Toc241608359 \h </w:instrText>
         </w:r>
         <w:r>
           <w:rPr>
@@ -2940,7 +2943,7 @@
           <w:noProof/>
         </w:rPr>
       </w:pPr>
-      <w:hyperlink w:anchor="_Toc241607339" w:history="1">
+      <w:hyperlink w:anchor="_Toc241608360" w:history="1">
         <w:r>
           <w:rPr>
             <w:rStyle w:val="aff8"/>
@@ -2968,7 +2971,7 @@
             <w:noProof/>
             <w:webHidden/>
           </w:rPr>
-          <w:instrText xml:space="preserve"> PAGEREF _Toc241607339 \h </w:instrText>
+          <w:instrText xml:space="preserve"> PAGEREF _Toc241608360 \h </w:instrText>
         </w:r>
         <w:r>
           <w:rPr>
@@ -3009,7 +3012,7 @@
           <w:noProof/>
         </w:rPr>
       </w:pPr>
-      <w:hyperlink w:anchor="_Toc241607340" w:history="1">
+      <w:hyperlink w:anchor="_Toc241608361" w:history="1">
         <w:r>
           <w:rPr>
             <w:rStyle w:val="aff8"/>
@@ -3037,7 +3040,7 @@
             <w:noProof/>
             <w:webHidden/>
           </w:rPr>
-          <w:instrText xml:space="preserve"> PAGEREF _Toc241607340 \h </w:instrText>
+          <w:instrText xml:space="preserve"> PAGEREF _Toc241608361 \h </w:instrText>
         </w:r>
         <w:r>
           <w:rPr>
@@ -3078,7 +3081,7 @@
           <w:noProof/>
         </w:rPr>
       </w:pPr>
-      <w:hyperlink w:anchor="_Toc241607341" w:history="1">
+      <w:hyperlink w:anchor="_Toc241608362" w:history="1">
         <w:r>
           <w:rPr>
             <w:rStyle w:val="aff8"/>
@@ -3106,7 +3109,7 @@
             <w:noProof/>
             <w:webHidden/>
           </w:rPr>
-          <w:instrText xml:space="preserve"> PAGEREF _Toc241607341 \h </w:instrText>
+          <w:instrText xml:space="preserve"> PAGEREF _Toc241608362 \h </w:instrText>
         </w:r>
         <w:r>
           <w:rPr>
@@ -3147,7 +3150,7 @@
           <w:noProof/>
         </w:rPr>
       </w:pPr>
-      <w:hyperlink w:anchor="_Toc241607342" w:history="1">
+      <w:hyperlink w:anchor="_Toc241608363" w:history="1">
         <w:r>
           <w:rPr>
             <w:rStyle w:val="aff8"/>
@@ -3175,7 +3178,7 @@
             <w:noProof/>
             <w:webHidden/>
           </w:rPr>
-          <w:instrText xml:space="preserve"> PAGEREF _Toc241607342 \h </w:instrText>
+          <w:instrText xml:space="preserve"> PAGEREF _Toc241608363 \h </w:instrText>
         </w:r>
         <w:r>
           <w:rPr>
@@ -3216,7 +3219,7 @@
           <w:noProof/>
         </w:rPr>
       </w:pPr>
-      <w:hyperlink w:anchor="_Toc241607343" w:history="1">
+      <w:hyperlink w:anchor="_Toc241608364" w:history="1">
         <w:r>
           <w:rPr>
             <w:rStyle w:val="aff8"/>
@@ -3244,7 +3247,7 @@
             <w:noProof/>
             <w:webHidden/>
           </w:rPr>
-          <w:instrText xml:space="preserve"> PAGEREF _Toc241607343 \h </w:instrText>
+          <w:instrText xml:space="preserve"> PAGEREF _Toc241608364 \h </w:instrText>
         </w:r>
         <w:r>
           <w:rPr>
@@ -3285,7 +3288,7 @@
           <w:noProof/>
         </w:rPr>
       </w:pPr>
-      <w:hyperlink w:anchor="_Toc241607344" w:history="1">
+      <w:hyperlink w:anchor="_Toc241608365" w:history="1">
         <w:r>
           <w:rPr>
             <w:rStyle w:val="aff8"/>
@@ -3313,7 +3316,7 @@
             <w:noProof/>
             <w:webHidden/>
           </w:rPr>
-          <w:instrText xml:space="preserve"> PAGEREF _Toc241607344 \h </w:instrText>
+          <w:instrText xml:space="preserve"> PAGEREF _Toc241608365 \h </w:instrText>
         </w:r>
         <w:r>
           <w:rPr>
@@ -3354,7 +3357,7 @@
           <w:noProof/>
         </w:rPr>
       </w:pPr>
-      <w:hyperlink w:anchor="_Toc241607345" w:history="1">
+      <w:hyperlink w:anchor="_Toc241608366" w:history="1">
         <w:r>
           <w:rPr>
             <w:rStyle w:val="aff8"/>
@@ -3382,7 +3385,7 @@
             <w:noProof/>
             <w:webHidden/>
           </w:rPr>
-          <w:instrText xml:space="preserve"> PAGEREF _Toc241607345 \h </w:instrText>
+          <w:instrText xml:space="preserve"> PAGEREF _Toc241608366 \h </w:instrText>
         </w:r>
         <w:r>
           <w:rPr>
@@ -3423,7 +3426,7 @@
           <w:noProof/>
         </w:rPr>
       </w:pPr>
-      <w:hyperlink w:anchor="_Toc241607346" w:history="1">
+      <w:hyperlink w:anchor="_Toc241608367" w:history="1">
         <w:r>
           <w:rPr>
             <w:rStyle w:val="aff8"/>
@@ -3451,7 +3454,7 @@
             <w:noProof/>
             <w:webHidden/>
           </w:rPr>
-          <w:instrText xml:space="preserve"> PAGEREF _Toc241607346 \h </w:instrText>
+          <w:instrText xml:space="preserve"> PAGEREF _Toc241608367 \h </w:instrText>
         </w:r>
         <w:r>
           <w:rPr>
@@ -3492,7 +3495,7 @@
           <w:noProof/>
         </w:rPr>
       </w:pPr>
-      <w:hyperlink w:anchor="_Toc241607347" w:history="1">
+      <w:hyperlink w:anchor="_Toc241608368" w:history="1">
         <w:r>
           <w:rPr>
             <w:rStyle w:val="aff8"/>
@@ -3520,7 +3523,7 @@
             <w:noProof/>
             <w:webHidden/>
           </w:rPr>
-          <w:instrText xml:space="preserve"> PAGEREF _Toc241607347 \h </w:instrText>
+          <w:instrText xml:space="preserve"> PAGEREF _Toc241608368 \h </w:instrText>
         </w:r>
         <w:r>
           <w:rPr>
@@ -3561,7 +3564,7 @@
           <w:noProof/>
         </w:rPr>
       </w:pPr>
-      <w:hyperlink w:anchor="_Toc241607348" w:history="1">
+      <w:hyperlink w:anchor="_Toc241608369" w:history="1">
         <w:r>
           <w:rPr>
             <w:rStyle w:val="aff8"/>
@@ -3589,7 +3592,7 @@
             <w:noProof/>
             <w:webHidden/>
           </w:rPr>
-          <w:instrText xml:space="preserve"> PAGEREF _Toc241607348 \h </w:instrText>
+          <w:instrText xml:space="preserve"> PAGEREF _Toc241608369 \h </w:instrText>
         </w:r>
         <w:r>
           <w:rPr>
@@ -3630,7 +3633,7 @@
           <w:noProof/>
         </w:rPr>
       </w:pPr>
-      <w:hyperlink w:anchor="_Toc241607349" w:history="1">
+      <w:hyperlink w:anchor="_Toc241608370" w:history="1">
         <w:r>
           <w:rPr>
             <w:rStyle w:val="aff8"/>
@@ -3658,7 +3661,7 @@
             <w:noProof/>
             <w:webHidden/>
           </w:rPr>
-          <w:instrText xml:space="preserve"> PAGEREF _Toc241607349 \h </w:instrText>
+          <w:instrText xml:space="preserve"> PAGEREF _Toc241608370 \h </w:instrText>
         </w:r>
         <w:r>
           <w:rPr>
@@ -3699,7 +3702,7 @@
           <w:noProof/>
         </w:rPr>
       </w:pPr>
-      <w:hyperlink w:anchor="_Toc241607350" w:history="1">
+      <w:hyperlink w:anchor="_Toc241608371" w:history="1">
         <w:r>
           <w:rPr>
             <w:rStyle w:val="aff8"/>
@@ -3727,7 +3730,7 @@
             <w:noProof/>
             <w:webHidden/>
           </w:rPr>
-          <w:instrText xml:space="preserve"> PAGEREF _Toc241607350 \h </w:instrText>
+          <w:instrText xml:space="preserve"> PAGEREF _Toc241608371 \h </w:instrText>
         </w:r>
         <w:r>
           <w:rPr>
@@ -3768,7 +3771,7 @@
           <w:noProof/>
         </w:rPr>
       </w:pPr>
-      <w:hyperlink w:anchor="_Toc241607351" w:history="1">
+      <w:hyperlink w:anchor="_Toc241608372" w:history="1">
         <w:r>
           <w:rPr>
             <w:rStyle w:val="aff8"/>
@@ -3796,7 +3799,7 @@
             <w:noProof/>
             <w:webHidden/>
           </w:rPr>
-          <w:instrText xml:space="preserve"> PAGEREF _Toc241607351 \h </w:instrText>
+          <w:instrText xml:space="preserve"> PAGEREF _Toc241608372 \h </w:instrText>
         </w:r>
         <w:r>
           <w:rPr>
@@ -3841,7 +3844,7 @@
       <w:pPr>
         <w:pStyle w:val="1"/>
       </w:pPr>
-      <w:bookmarkStart w:id="0" w:name="_Toc241607299"/>
+      <w:bookmarkStart w:id="0" w:name="_Toc241608320"/>
       <w:r>
         <w:lastRenderedPageBreak/>
         <w:t>Ход работы</w:t>
@@ -3861,12 +3864,12 @@
       <w:pPr>
         <w:pStyle w:val="21"/>
       </w:pPr>
-      <w:bookmarkStart w:id="1" w:name="_Toc241607300"/>
-      <w:r>
-        <w:t>С</w:t>
-      </w:r>
-      <w:r>
-        <w:t>сылки</w:t>
+      <w:bookmarkStart w:id="1" w:name="_Toc241608321"/>
+      <w:r>
+        <w:t>Ссы</w:t>
+      </w:r>
+      <w:r>
+        <w:t>лки</w:t>
       </w:r>
       <w:bookmarkEnd w:id="1"/>
     </w:p>
@@ -4155,7 +4158,7 @@
       <w:pPr>
         <w:pStyle w:val="21"/>
       </w:pPr>
-      <w:bookmarkStart w:id="2" w:name="_Toc241607301"/>
+      <w:bookmarkStart w:id="2" w:name="_Toc241608322"/>
       <w:r>
         <w:t xml:space="preserve">1–2. Python, pip, </w:t>
       </w:r>
@@ -4491,7 +4494,7 @@
       <w:pPr>
         <w:pStyle w:val="21"/>
       </w:pPr>
-      <w:bookmarkStart w:id="3" w:name="_Toc241607302"/>
+      <w:bookmarkStart w:id="3" w:name="_Toc241608323"/>
       <w:r>
         <w:t>3. Каталог проекта и виртуальное окружение</w:t>
       </w:r>
@@ -4534,7 +4537,7 @@
       <w:pPr>
         <w:pStyle w:val="21"/>
       </w:pPr>
-      <w:bookmarkStart w:id="4" w:name="_Toc241607303"/>
+      <w:bookmarkStart w:id="4" w:name="_Toc241608324"/>
       <w:r>
         <w:t xml:space="preserve">4. Фиксация </w:t>
       </w:r>
@@ -4903,7 +4906,7 @@
       <w:pPr>
         <w:pStyle w:val="21"/>
       </w:pPr>
-      <w:bookmarkStart w:id="5" w:name="_Toc241607304"/>
+      <w:bookmarkStart w:id="5" w:name="_Toc241608325"/>
       <w:r>
         <w:t>5. Установка генераторов и каркас сайтов</w:t>
       </w:r>
@@ -5153,7 +5156,7 @@
       <w:pPr>
         <w:pStyle w:val="21"/>
       </w:pPr>
-      <w:bookmarkStart w:id="6" w:name="_Toc241607305"/>
+      <w:bookmarkStart w:id="6" w:name="_Toc241608326"/>
       <w:r>
         <w:t>6. Локальная сборка</w:t>
       </w:r>
@@ -5287,7 +5290,7 @@
       <w:pPr>
         <w:pStyle w:val="21"/>
       </w:pPr>
-      <w:bookmarkStart w:id="7" w:name="_Toc241607306"/>
+      <w:bookmarkStart w:id="7" w:name="_Toc241608327"/>
       <w:r>
         <w:t>7. Репозиторий на GitHub</w:t>
       </w:r>
@@ -5344,7 +5347,7 @@
       <w:pPr>
         <w:pStyle w:val="21"/>
       </w:pPr>
-      <w:bookmarkStart w:id="8" w:name="_Toc241607307"/>
+      <w:bookmarkStart w:id="8" w:name="_Toc241608328"/>
       <w:r>
         <w:t>8. GitHub Actions и GitHub Pages</w:t>
       </w:r>
@@ -6373,7 +6376,7 @@
       <w:pPr>
         <w:pStyle w:val="21"/>
       </w:pPr>
-      <w:bookmarkStart w:id="9" w:name="_Toc241607308"/>
+      <w:bookmarkStart w:id="9" w:name="_Toc241608329"/>
       <w:r>
         <w:t>9. Учётные записи на отечественных площадках</w:t>
       </w:r>
@@ -7034,7 +7037,7 @@
       <w:pPr>
         <w:pStyle w:val="21"/>
       </w:pPr>
-      <w:bookmarkStart w:id="10" w:name="_Toc241607309"/>
+      <w:bookmarkStart w:id="10" w:name="_Toc241608330"/>
       <w:r>
         <w:t>10. Workflow для отечественных площадок</w:t>
       </w:r>
@@ -7735,7 +7738,7 @@
       <w:pPr>
         <w:pStyle w:val="21"/>
       </w:pPr>
-      <w:bookmarkStart w:id="11" w:name="_Toc241607310"/>
+      <w:bookmarkStart w:id="11" w:name="_Toc241608331"/>
       <w:r>
         <w:t>11. Базовый URL</w:t>
       </w:r>
@@ -8265,7 +8268,7 @@
       <w:pPr>
         <w:pStyle w:val="21"/>
       </w:pPr>
-      <w:bookmarkStart w:id="12" w:name="_Toc241607311"/>
+      <w:bookmarkStart w:id="12" w:name="_Toc241608332"/>
       <w:r>
         <w:t>12. Проверка результата развёртывания</w:t>
       </w:r>
@@ -10513,7 +10516,7 @@
           <w:noProof/>
         </w:rPr>
         <w:drawing>
-          <wp:inline distT="0" distB="0" distL="0" distR="0" wp14:anchorId="2C6DEBC7" wp14:editId="0FFAF794">
+          <wp:inline distT="0" distB="0" distL="0" distR="0" wp14:anchorId="69D43E3C" wp14:editId="0E647B89">
             <wp:extent cx="5940000" cy="4242857"/>
             <wp:effectExtent l="0" t="0" r="0" b="0"/>
             <wp:docPr id="1" name="Picture 1"/>
@@ -10587,7 +10590,7 @@
         </w:rPr>
         <w:lastRenderedPageBreak/>
         <w:drawing>
-          <wp:inline distT="0" distB="0" distL="0" distR="0" wp14:anchorId="29F8AAC7" wp14:editId="43BC6F1B">
+          <wp:inline distT="0" distB="0" distL="0" distR="0" wp14:anchorId="3FE3F449" wp14:editId="271F733B">
             <wp:extent cx="5940000" cy="4242857"/>
             <wp:effectExtent l="0" t="0" r="0" b="0"/>
             <wp:docPr id="2" name="Picture 2"/>
@@ -10660,7 +10663,7 @@
           <w:noProof/>
         </w:rPr>
         <w:drawing>
-          <wp:inline distT="0" distB="0" distL="0" distR="0" wp14:anchorId="2EFF3E58" wp14:editId="11078027">
+          <wp:inline distT="0" distB="0" distL="0" distR="0" wp14:anchorId="7C9468AF" wp14:editId="64810200">
             <wp:extent cx="5940000" cy="4242857"/>
             <wp:effectExtent l="0" t="0" r="0" b="0"/>
             <wp:docPr id="3" name="Picture 3"/>
@@ -10734,7 +10737,7 @@
         </w:rPr>
         <w:lastRenderedPageBreak/>
         <w:drawing>
-          <wp:inline distT="0" distB="0" distL="0" distR="0" wp14:anchorId="67CC04E6" wp14:editId="18E4D641">
+          <wp:inline distT="0" distB="0" distL="0" distR="0" wp14:anchorId="4436A0BA" wp14:editId="7EC0DA88">
             <wp:extent cx="5940000" cy="4242857"/>
             <wp:effectExtent l="0" t="0" r="0" b="0"/>
             <wp:docPr id="4" name="Picture 4"/>
@@ -10814,7 +10817,7 @@
           <w:noProof/>
         </w:rPr>
         <w:drawing>
-          <wp:inline distT="0" distB="0" distL="0" distR="0" wp14:anchorId="1DFC4844" wp14:editId="726D2B92">
+          <wp:inline distT="0" distB="0" distL="0" distR="0" wp14:anchorId="478C80E0" wp14:editId="7438F9BF">
             <wp:extent cx="5940000" cy="4242857"/>
             <wp:effectExtent l="0" t="0" r="0" b="0"/>
             <wp:docPr id="5" name="Picture 5"/>
@@ -10866,7 +10869,7 @@
       <w:pPr>
         <w:pStyle w:val="21"/>
       </w:pPr>
-      <w:bookmarkStart w:id="13" w:name="_Toc241607312"/>
+      <w:bookmarkStart w:id="13" w:name="_Toc241608333"/>
       <w:r>
         <w:lastRenderedPageBreak/>
         <w:t>13. Лицензии</w:t>
@@ -11206,7 +11209,7 @@
       <w:pPr>
         <w:pStyle w:val="21"/>
       </w:pPr>
-      <w:bookmarkStart w:id="14" w:name="_Toc241607313"/>
+      <w:bookmarkStart w:id="14" w:name="_Toc241608334"/>
       <w:r>
         <w:t>14. Отладка</w:t>
       </w:r>
@@ -11230,7 +11233,7 @@
       <w:pPr>
         <w:pStyle w:val="1"/>
       </w:pPr>
-      <w:bookmarkStart w:id="15" w:name="_Toc241607314"/>
+      <w:bookmarkStart w:id="15" w:name="_Toc241608335"/>
       <w:r>
         <w:lastRenderedPageBreak/>
         <w:t>T5.</w:t>
@@ -11510,7 +11513,7 @@
       <w:pPr>
         <w:pStyle w:val="21"/>
       </w:pPr>
-      <w:bookmarkStart w:id="16" w:name="_Toc241607315"/>
+      <w:bookmarkStart w:id="16" w:name="_Toc241608336"/>
       <w:r>
         <w:t>1. Постоянные ссылки и стабильность URL</w:t>
       </w:r>
@@ -12347,7 +12350,7 @@
       <w:pPr>
         <w:pStyle w:val="21"/>
       </w:pPr>
-      <w:bookmarkStart w:id="17" w:name="_Toc241607316"/>
+      <w:bookmarkStart w:id="17" w:name="_Toc241608337"/>
       <w:r>
         <w:t>2. Версионирование сайта и соответствие версий сайта, кода и данных</w:t>
       </w:r>
@@ -13090,7 +13093,7 @@
       <w:pPr>
         <w:pStyle w:val="21"/>
       </w:pPr>
-      <w:bookmarkStart w:id="18" w:name="_Toc241607317"/>
+      <w:bookmarkStart w:id="18" w:name="_Toc241608338"/>
       <w:r>
         <w:t>3. DOI и ORCID</w:t>
       </w:r>
@@ -13685,7 +13688,7 @@
       <w:pPr>
         <w:pStyle w:val="21"/>
       </w:pPr>
-      <w:bookmarkStart w:id="19" w:name="_Toc241607318"/>
+      <w:bookmarkStart w:id="19" w:name="_Toc241608339"/>
       <w:r>
         <w:t>4. Метаданные для индексации</w:t>
       </w:r>
@@ -14942,7 +14945,7 @@
           <w:rFonts w:ascii="Consolas" w:eastAsia="Consolas" w:hAnsi="Consolas"/>
           <w:sz w:val="16"/>
         </w:rPr>
-        <w:t>r" content="ExcaliBBur"&gt;</w:t>
+        <w:t>r" content="Павлов, Александр Сергеевич"&gt;</w:t>
       </w:r>
     </w:p>
     <w:p>
@@ -14998,14 +15001,14 @@
           <w:rFonts w:ascii="Consolas" w:eastAsia="Consolas" w:hAnsi="Consolas"/>
           <w:sz w:val="16"/>
         </w:rPr>
-        <w:t>&lt;meta name="DC.title" c</w:t>
+        <w:t xml:space="preserve">&lt;meta </w:t>
       </w:r>
       <w:r>
         <w:rPr>
           <w:rFonts w:ascii="Consolas" w:eastAsia="Consolas" w:hAnsi="Consolas"/>
           <w:sz w:val="16"/>
         </w:rPr>
-        <w:t>ontent="Стресс-тест научного контента … — Публикация результатов экспериментов"&gt;</w:t>
+        <w:t>name="DC.title" content="Стресс-тест научного контента … — Публикация результатов экспериментов"&gt;</w:t>
       </w:r>
     </w:p>
     <w:p>
@@ -15047,14 +15050,14 @@
           <w:rFonts w:ascii="Consolas" w:eastAsia="Consolas" w:hAnsi="Consolas"/>
           <w:sz w:val="16"/>
         </w:rPr>
-        <w:t>&lt;link rel="license" href="https://creativecommons.or</w:t>
+        <w:t>&lt;link rel="license" href="https://c</w:t>
       </w:r>
       <w:r>
         <w:rPr>
           <w:rFonts w:ascii="Consolas" w:eastAsia="Consolas" w:hAnsi="Consolas"/>
           <w:sz w:val="16"/>
         </w:rPr>
-        <w:t>g/licenses/by/4.0/"&gt;</w:t>
+        <w:t>reativecommons.org/licenses/by/4.0/"&gt;</w:t>
       </w:r>
     </w:p>
     <w:p>
@@ -15082,17 +15085,17 @@
       </w:r>
       <w:r>
         <w:lastRenderedPageBreak/>
-        <w:t>лучше — на доменах научных организаций и репозиториев. Мета-теги необход</w:t>
-      </w:r>
-      <w:r>
-        <w:t>имы, но не достаточны; для реальной индексации надёжнее Zenodo.</w:t>
+        <w:t xml:space="preserve">лучше — на доменах научных организаций и репозиториев. </w:t>
+      </w:r>
+      <w:r>
+        <w:t>Мета-теги необходимы, но не достаточны; для реальной индексации надёжнее Zenodo.</w:t>
       </w:r>
     </w:p>
     <w:p>
       <w:pPr>
         <w:pStyle w:val="21"/>
       </w:pPr>
-      <w:bookmarkStart w:id="20" w:name="_Toc241607319"/>
+      <w:bookmarkStart w:id="20" w:name="_Toc241608340"/>
       <w:r>
         <w:t>5. Лицензирование</w:t>
       </w:r>
@@ -15211,7 +15214,13 @@
               <w:rPr>
                 <w:sz w:val="20"/>
               </w:rPr>
-              <w:t>CC BY 4.0 (</w:t>
+              <w:t xml:space="preserve">CC BY </w:t>
+            </w:r>
+            <w:r>
+              <w:rPr>
+                <w:sz w:val="20"/>
+              </w:rPr>
+              <w:t>4.0 (</w:t>
             </w:r>
             <w:r>
               <w:rPr>
@@ -15482,7 +15491,7 @@
       <w:pPr>
         <w:pStyle w:val="21"/>
       </w:pPr>
-      <w:bookmarkStart w:id="21" w:name="_Toc241607320"/>
+      <w:bookmarkStart w:id="21" w:name="_Toc241608341"/>
       <w:r>
         <w:t>6. Соответствие принципам FAIR</w:t>
       </w:r>
@@ -15947,7 +15956,7 @@
       <w:pPr>
         <w:pStyle w:val="21"/>
       </w:pPr>
-      <w:bookmarkStart w:id="22" w:name="_Toc241607321"/>
+      <w:bookmarkStart w:id="22" w:name="_Toc241608342"/>
       <w:r>
         <w:t>7. Сводная матрица</w:t>
       </w:r>
@@ -17323,7 +17332,7 @@
       <w:pPr>
         <w:pStyle w:val="21"/>
       </w:pPr>
-      <w:bookmarkStart w:id="23" w:name="_Toc241607322"/>
+      <w:bookmarkStart w:id="23" w:name="_Toc241608343"/>
       <w:r>
         <w:t>8. Что достижимо при размещении на Helios</w:t>
       </w:r>
@@ -18706,7 +18715,7 @@
       <w:pPr>
         <w:pStyle w:val="21"/>
       </w:pPr>
-      <w:bookmarkStart w:id="24" w:name="_Toc241607323"/>
+      <w:bookmarkStart w:id="24" w:name="_Toc241608344"/>
       <w:r>
         <w:t>9. Реализация в проекте</w:t>
       </w:r>
@@ -19329,7 +19338,7 @@
       <w:pPr>
         <w:pStyle w:val="21"/>
       </w:pPr>
-      <w:bookmarkStart w:id="25" w:name="_Toc241607324"/>
+      <w:bookmarkStart w:id="25" w:name="_Toc241608345"/>
       <w:r>
         <w:t>10. Вывод по T5</w:t>
       </w:r>
@@ -19396,7 +19405,7 @@
       <w:pPr>
         <w:pStyle w:val="1"/>
       </w:pPr>
-      <w:bookmarkStart w:id="26" w:name="_Toc241607325"/>
+      <w:bookmarkStart w:id="26" w:name="_Toc241608346"/>
       <w:r>
         <w:lastRenderedPageBreak/>
         <w:t>P2. Страница — стресс-тест научного контента</w:t>
@@ -19407,7 +19416,7 @@
       <w:pPr>
         <w:pStyle w:val="21"/>
       </w:pPr>
-      <w:bookmarkStart w:id="27" w:name="_Toc241607326"/>
+      <w:bookmarkStart w:id="27" w:name="_Toc241608347"/>
       <w:r>
         <w:t>1. Постановка</w:t>
       </w:r>
@@ -19735,7 +19744,7 @@
       <w:pPr>
         <w:pStyle w:val="21"/>
       </w:pPr>
-      <w:bookmarkStart w:id="28" w:name="_Toc241607327"/>
+      <w:bookmarkStart w:id="28" w:name="_Toc241608348"/>
       <w:r>
         <w:t>2. Обязательный состав страницы и способ реализации</w:t>
       </w:r>
@@ -20746,7 +20755,7 @@
       <w:pPr>
         <w:pStyle w:val="21"/>
       </w:pPr>
-      <w:bookmarkStart w:id="29" w:name="_Toc241607328"/>
+      <w:bookmarkStart w:id="29" w:name="_Toc241608349"/>
       <w:r>
         <w:t>3. Измерения</w:t>
       </w:r>
@@ -24688,7 +24697,7 @@
           <w:noProof/>
         </w:rPr>
         <w:drawing>
-          <wp:inline distT="0" distB="0" distL="0" distR="0" wp14:anchorId="612D7C32" wp14:editId="29026341">
+          <wp:inline distT="0" distB="0" distL="0" distR="0" wp14:anchorId="48D21590" wp14:editId="3E9214D9">
             <wp:extent cx="5940000" cy="4455000"/>
             <wp:effectExtent l="0" t="0" r="0" b="0"/>
             <wp:docPr id="6" name="Picture 6"/>
@@ -24735,7 +24744,7 @@
         </w:rPr>
         <w:lastRenderedPageBreak/>
         <w:drawing>
-          <wp:inline distT="0" distB="0" distL="0" distR="0" wp14:anchorId="5BA68D54" wp14:editId="1F88ABC1">
+          <wp:inline distT="0" distB="0" distL="0" distR="0" wp14:anchorId="05369304" wp14:editId="19B2AD30">
             <wp:extent cx="5940000" cy="4455000"/>
             <wp:effectExtent l="0" t="0" r="0" b="0"/>
             <wp:docPr id="7" name="Picture 7"/>
@@ -24781,7 +24790,7 @@
           <w:noProof/>
         </w:rPr>
         <w:drawing>
-          <wp:inline distT="0" distB="0" distL="0" distR="0" wp14:anchorId="5931D597" wp14:editId="67DBF0D2">
+          <wp:inline distT="0" distB="0" distL="0" distR="0" wp14:anchorId="76AACEC5" wp14:editId="11CB4E96">
             <wp:extent cx="5940000" cy="4455000"/>
             <wp:effectExtent l="0" t="0" r="0" b="0"/>
             <wp:docPr id="8" name="Picture 8"/>
@@ -24828,7 +24837,7 @@
         </w:rPr>
         <w:lastRenderedPageBreak/>
         <w:drawing>
-          <wp:inline distT="0" distB="0" distL="0" distR="0" wp14:anchorId="7BB2A8DD" wp14:editId="10051ACD">
+          <wp:inline distT="0" distB="0" distL="0" distR="0" wp14:anchorId="3F927D13" wp14:editId="71D51EA9">
             <wp:extent cx="5940000" cy="3550078"/>
             <wp:effectExtent l="0" t="0" r="0" b="0"/>
             <wp:docPr id="9" name="Picture 9"/>
@@ -24886,7 +24895,7 @@
           <w:noProof/>
         </w:rPr>
         <w:drawing>
-          <wp:inline distT="0" distB="0" distL="0" distR="0" wp14:anchorId="2EE1EF55" wp14:editId="2CA766F2">
+          <wp:inline distT="0" distB="0" distL="0" distR="0" wp14:anchorId="180634A8" wp14:editId="411EBCDD">
             <wp:extent cx="5940000" cy="4455000"/>
             <wp:effectExtent l="0" t="0" r="0" b="0"/>
             <wp:docPr id="10" name="Picture 10"/>
@@ -24933,7 +24942,7 @@
         </w:rPr>
         <w:lastRenderedPageBreak/>
         <w:drawing>
-          <wp:inline distT="0" distB="0" distL="0" distR="0" wp14:anchorId="2D252E4D" wp14:editId="066E1864">
+          <wp:inline distT="0" distB="0" distL="0" distR="0" wp14:anchorId="53404E17" wp14:editId="6500A018">
             <wp:extent cx="5940000" cy="4455000"/>
             <wp:effectExtent l="0" t="0" r="0" b="0"/>
             <wp:docPr id="11" name="Picture 11"/>
@@ -24979,7 +24988,7 @@
           <w:noProof/>
         </w:rPr>
         <w:drawing>
-          <wp:inline distT="0" distB="0" distL="0" distR="0" wp14:anchorId="48AA74B1" wp14:editId="4E4B8543">
+          <wp:inline distT="0" distB="0" distL="0" distR="0" wp14:anchorId="640AAD75" wp14:editId="08AD3B32">
             <wp:extent cx="5940000" cy="4455000"/>
             <wp:effectExtent l="0" t="0" r="0" b="0"/>
             <wp:docPr id="12" name="Picture 12"/>
@@ -25026,7 +25035,7 @@
         </w:rPr>
         <w:lastRenderedPageBreak/>
         <w:drawing>
-          <wp:inline distT="0" distB="0" distL="0" distR="0" wp14:anchorId="424448CF" wp14:editId="50AA1580">
+          <wp:inline distT="0" distB="0" distL="0" distR="0" wp14:anchorId="78C4B0E5" wp14:editId="2CC34930">
             <wp:extent cx="5940000" cy="1758797"/>
             <wp:effectExtent l="0" t="0" r="0" b="0"/>
             <wp:docPr id="13" name="Picture 13"/>
@@ -25084,7 +25093,7 @@
           <w:noProof/>
         </w:rPr>
         <w:drawing>
-          <wp:inline distT="0" distB="0" distL="0" distR="0" wp14:anchorId="2807A359" wp14:editId="48124AA0">
+          <wp:inline distT="0" distB="0" distL="0" distR="0" wp14:anchorId="5ADB83FD" wp14:editId="32635AAD">
             <wp:extent cx="5940000" cy="3667950"/>
             <wp:effectExtent l="0" t="0" r="0" b="0"/>
             <wp:docPr id="14" name="Picture 14"/>
@@ -25131,7 +25140,7 @@
         </w:rPr>
         <w:lastRenderedPageBreak/>
         <w:drawing>
-          <wp:inline distT="0" distB="0" distL="0" distR="0" wp14:anchorId="00C5A5EF" wp14:editId="397B7214">
+          <wp:inline distT="0" distB="0" distL="0" distR="0" wp14:anchorId="289A698E" wp14:editId="46D023BC">
             <wp:extent cx="5940000" cy="3667950"/>
             <wp:effectExtent l="0" t="0" r="0" b="0"/>
             <wp:docPr id="15" name="Picture 15"/>
@@ -25189,7 +25198,7 @@
           <w:noProof/>
         </w:rPr>
         <w:drawing>
-          <wp:inline distT="0" distB="0" distL="0" distR="0" wp14:anchorId="4FD44235" wp14:editId="1CFCC180">
+          <wp:inline distT="0" distB="0" distL="0" distR="0" wp14:anchorId="39F7B126" wp14:editId="6E53CE14">
             <wp:extent cx="5940000" cy="3667950"/>
             <wp:effectExtent l="0" t="0" r="0" b="0"/>
             <wp:docPr id="16" name="Picture 16"/>
@@ -25236,7 +25245,7 @@
         </w:rPr>
         <w:lastRenderedPageBreak/>
         <w:drawing>
-          <wp:inline distT="0" distB="0" distL="0" distR="0" wp14:anchorId="2798019A" wp14:editId="0D8229F8">
+          <wp:inline distT="0" distB="0" distL="0" distR="0" wp14:anchorId="2015B5DA" wp14:editId="7BEE24EA">
             <wp:extent cx="5940000" cy="3667950"/>
             <wp:effectExtent l="0" t="0" r="0" b="0"/>
             <wp:docPr id="17" name="Picture 17"/>
@@ -25288,7 +25297,7 @@
       <w:pPr>
         <w:pStyle w:val="21"/>
       </w:pPr>
-      <w:bookmarkStart w:id="30" w:name="_Toc241607329"/>
+      <w:bookmarkStart w:id="30" w:name="_Toc241608350"/>
       <w:r>
         <w:t>4. Что не удалось реализовать и какой ценой</w:t>
       </w:r>
@@ -26071,7 +26080,7 @@
       <w:pPr>
         <w:pStyle w:val="21"/>
       </w:pPr>
-      <w:bookmarkStart w:id="31" w:name="_Toc241607330"/>
+      <w:bookmarkStart w:id="31" w:name="_Toc241608351"/>
       <w:r>
         <w:t>5. Вывод по P2</w:t>
       </w:r>
@@ -26131,7 +26140,7 @@
       <w:pPr>
         <w:pStyle w:val="1"/>
       </w:pPr>
-      <w:bookmarkStart w:id="32" w:name="_Toc241607331"/>
+      <w:bookmarkStart w:id="32" w:name="_Toc241608352"/>
       <w:r>
         <w:lastRenderedPageBreak/>
         <w:t>Отладка</w:t>
@@ -26154,7 +26163,7 @@
       <w:pPr>
         <w:pStyle w:val="21"/>
       </w:pPr>
-      <w:bookmarkStart w:id="33" w:name="_Toc241607332"/>
+      <w:bookmarkStart w:id="33" w:name="_Toc241608353"/>
       <w:r>
         <w:t>1. Формулы в MkDocs выводятся сырым TeX</w:t>
       </w:r>
@@ -26432,7 +26441,7 @@
       <w:pPr>
         <w:pStyle w:val="21"/>
       </w:pPr>
-      <w:bookmarkStart w:id="34" w:name="_Toc241607333"/>
+      <w:bookmarkStart w:id="34" w:name="_Toc241608354"/>
       <w:r>
         <w:t>2. mkdocs build --strict падает на ссылке на якорь</w:t>
       </w:r>
@@ -26680,7 +26689,7 @@
       <w:pPr>
         <w:pStyle w:val="21"/>
       </w:pPr>
-      <w:bookmarkStart w:id="35" w:name="_Toc241607334"/>
+      <w:bookmarkStart w:id="35" w:name="_Toc241608355"/>
       <w:r>
         <w:t>3. Сниппет метки версии не раскрываетс</w:t>
       </w:r>
@@ -26840,7 +26849,7 @@
       <w:pPr>
         <w:pStyle w:val="21"/>
       </w:pPr>
-      <w:bookmarkStart w:id="36" w:name="_Toc241607335"/>
+      <w:bookmarkStart w:id="36" w:name="_Toc241608356"/>
       <w:r>
         <w:t xml:space="preserve">4. Интерактивный график Plotly не </w:t>
       </w:r>
@@ -27096,7 +27105,7 @@
       <w:pPr>
         <w:pStyle w:val="21"/>
       </w:pPr>
-      <w:bookmarkStart w:id="37" w:name="_Toc241607336"/>
+      <w:bookmarkStart w:id="37" w:name="_Toc241608357"/>
       <w:r>
         <w:t>5. Healthcheck падае</w:t>
       </w:r>
@@ -27256,7 +27265,7 @@
       <w:pPr>
         <w:pStyle w:val="21"/>
       </w:pPr>
-      <w:bookmarkStart w:id="38" w:name="_Toc241607337"/>
+      <w:bookmarkStart w:id="38" w:name="_Toc241608358"/>
       <w:r>
         <w:t>6. Healthcheck не находит русское слово в индексе поиска MkDocs</w:t>
       </w:r>
@@ -27407,7 +27416,7 @@
       <w:pPr>
         <w:pStyle w:val="21"/>
       </w:pPr>
-      <w:bookmarkStart w:id="39" w:name="_Toc241607338"/>
+      <w:bookmarkStart w:id="39" w:name="_Toc241608359"/>
       <w:r>
         <w:t>7. scripts/measure.py не попадает в репозиторий</w:t>
       </w:r>
@@ -27590,7 +27599,7 @@
       <w:pPr>
         <w:pStyle w:val="21"/>
       </w:pPr>
-      <w:bookmarkStart w:id="40" w:name="_Toc241607339"/>
+      <w:bookmarkStart w:id="40" w:name="_Toc241608360"/>
       <w:r>
         <w:t>8. Внешние запросы у MkDocs при «полностью локальном» сайте</w:t>
       </w:r>
@@ -27700,7 +27709,7 @@
       <w:pPr>
         <w:pStyle w:val="21"/>
       </w:pPr>
-      <w:bookmarkStart w:id="41" w:name="_Toc241607340"/>
+      <w:bookmarkStart w:id="41" w:name="_Toc241608361"/>
       <w:r>
         <w:t>9. mkdocs-bibtex находит «цитату» внутри inline-кода</w:t>
       </w:r>
@@ -27913,7 +27922,7 @@
       <w:pPr>
         <w:pStyle w:val="21"/>
       </w:pPr>
-      <w:bookmarkStart w:id="42" w:name="_Toc241607341"/>
+      <w:bookmarkStart w:id="42" w:name="_Toc241608362"/>
       <w:r>
         <w:t>1</w:t>
       </w:r>
@@ -28135,7 +28144,7 @@
           <w:noProof/>
         </w:rPr>
         <w:drawing>
-          <wp:inline distT="0" distB="0" distL="0" distR="0" wp14:anchorId="5590CB56" wp14:editId="2ED57D95">
+          <wp:inline distT="0" distB="0" distL="0" distR="0" wp14:anchorId="7A0B121A" wp14:editId="15C25B45">
             <wp:extent cx="5940000" cy="5201743"/>
             <wp:effectExtent l="0" t="0" r="0" b="0"/>
             <wp:docPr id="18" name="Picture 18"/>
@@ -28254,7 +28263,7 @@
       <w:pPr>
         <w:pStyle w:val="21"/>
       </w:pPr>
-      <w:bookmarkStart w:id="43" w:name="_Toc241607342"/>
+      <w:bookmarkStart w:id="43" w:name="_Toc241608363"/>
       <w:r>
         <w:t>11. Первый запуск helios: exit code 255</w:t>
       </w:r>
@@ -28424,7 +28433,7 @@
           <w:noProof/>
         </w:rPr>
         <w:drawing>
-          <wp:inline distT="0" distB="0" distL="0" distR="0" wp14:anchorId="4F3F80B7" wp14:editId="5239C02D">
+          <wp:inline distT="0" distB="0" distL="0" distR="0" wp14:anchorId="5C34283A" wp14:editId="57F821D2">
             <wp:extent cx="5940000" cy="4242857"/>
             <wp:effectExtent l="0" t="0" r="0" b="0"/>
             <wp:docPr id="19" name="Picture 19"/>
@@ -28499,7 +28508,7 @@
       <w:pPr>
         <w:pStyle w:val="21"/>
       </w:pPr>
-      <w:bookmarkStart w:id="44" w:name="_Toc241607343"/>
+      <w:bookmarkStart w:id="44" w:name="_Toc241608364"/>
       <w:r>
         <w:t>12. Lighthouse: FCP 9,5 с у MkDocs на мобильном профиле</w:t>
       </w:r>
@@ -28739,7 +28748,7 @@
       <w:pPr>
         <w:pStyle w:val="21"/>
       </w:pPr>
-      <w:bookmarkStart w:id="45" w:name="_Toc241607344"/>
+      <w:bookmarkStart w:id="45" w:name="_Toc241608365"/>
       <w:r>
         <w:t>13. Замеры упёрлись в лимиты API</w:t>
       </w:r>
@@ -28934,7 +28943,7 @@
       <w:pPr>
         <w:pStyle w:val="1"/>
       </w:pPr>
-      <w:bookmarkStart w:id="46" w:name="_Toc241607345"/>
+      <w:bookmarkStart w:id="46" w:name="_Toc241608366"/>
       <w:r>
         <w:lastRenderedPageBreak/>
         <w:t>Вывод</w:t>
@@ -28945,7 +28954,7 @@
       <w:pPr>
         <w:pStyle w:val="21"/>
       </w:pPr>
-      <w:bookmarkStart w:id="47" w:name="_Toc241607346"/>
+      <w:bookmarkStart w:id="47" w:name="_Toc241608367"/>
       <w:r>
         <w:t>Рекомендуемый стек</w:t>
       </w:r>
@@ -29580,7 +29589,7 @@
       <w:pPr>
         <w:pStyle w:val="21"/>
       </w:pPr>
-      <w:bookmarkStart w:id="48" w:name="_Toc241607347"/>
+      <w:bookmarkStart w:id="48" w:name="_Toc241608368"/>
       <w:r>
         <w:t>Условия, при которых рекомендация меняется</w:t>
       </w:r>
@@ -30051,7 +30060,7 @@
       <w:pPr>
         <w:pStyle w:val="1"/>
       </w:pPr>
-      <w:bookmarkStart w:id="49" w:name="_Toc241607348"/>
+      <w:bookmarkStart w:id="49" w:name="_Toc241608369"/>
       <w:r>
         <w:lastRenderedPageBreak/>
         <w:t>Приложение А. Тексты workflow</w:t>
@@ -30074,7 +30083,7 @@
       <w:pPr>
         <w:pStyle w:val="21"/>
       </w:pPr>
-      <w:bookmarkStart w:id="50" w:name="_Toc241607349"/>
+      <w:bookmarkStart w:id="50" w:name="_Toc241608370"/>
       <w:r>
         <w:t>.github/workflows/pages.yml</w:t>
       </w:r>
@@ -31154,7 +31163,7 @@
       <w:pPr>
         <w:pStyle w:val="21"/>
       </w:pPr>
-      <w:bookmarkStart w:id="51" w:name="_Toc241607350"/>
+      <w:bookmarkStart w:id="51" w:name="_Toc241608371"/>
       <w:r>
         <w:t>.github/workflows/helios.yml</w:t>
       </w:r>
@@ -32402,7 +32411,7 @@
       <w:pPr>
         <w:pStyle w:val="21"/>
       </w:pPr>
-      <w:bookmarkStart w:id="52" w:name="_Toc241607351"/>
+      <w:bookmarkStart w:id="52" w:name="_Toc241608372"/>
       <w:r>
         <w:t>.github/workflows/vps.yml</w:t>
       </w:r>
@@ -33539,6 +33548,7 @@
       <w:pgSz w:w="11906" w:h="16838"/>
       <w:pgMar w:top="1134" w:right="850" w:bottom="1134" w:left="1701" w:header="720" w:footer="720" w:gutter="0"/>
       <w:cols w:space="720"/>
+      <w:titlePg/>
       <w:docGrid w:linePitch="360"/>
     </w:sectPr>
   </w:body>
@@ -45219,7 +45229,7 @@
     <w:autoRedefine/>
     <w:uiPriority w:val="39"/>
     <w:unhideWhenUsed/>
-    <w:rsid w:val="00CA5713"/>
+    <w:rsid w:val="0076689A"/>
     <w:pPr>
       <w:spacing w:after="100"/>
     </w:pPr>
@@ -45231,7 +45241,7 @@
     <w:autoRedefine/>
     <w:uiPriority w:val="39"/>
     <w:unhideWhenUsed/>
-    <w:rsid w:val="00CA5713"/>
+    <w:rsid w:val="0076689A"/>
     <w:pPr>
       <w:spacing w:after="100"/>
       <w:ind w:left="240"/>
@@ -45242,7 +45252,7 @@
     <w:basedOn w:val="a2"/>
     <w:uiPriority w:val="99"/>
     <w:unhideWhenUsed/>
-    <w:rsid w:val="00CA5713"/>
+    <w:rsid w:val="0076689A"/>
     <w:rPr>
       <w:color w:val="0000FF" w:themeColor="hyperlink"/>
       <w:u w:val="single"/>

</xml_diff>

<commit_message>
Own theme: sunflower/raspberry palette, local Golos Text and Unbounded fonts; refreshed P2 measurements
</commit_message>
<xml_diff>
--- a/report/static_site_report.docx
+++ b/report/static_site_report.docx
@@ -183,7 +183,7 @@
       <w:r>
         <w:fldChar w:fldCharType="separate"/>
       </w:r>
-      <w:hyperlink w:anchor="_Toc241609566" w:history="1">
+      <w:hyperlink w:anchor="_Toc241611345" w:history="1">
         <w:r>
           <w:rPr>
             <w:rStyle w:val="aff8"/>
@@ -211,7 +211,7 @@
             <w:noProof/>
             <w:webHidden/>
           </w:rPr>
-          <w:instrText xml:space="preserve"> PAGEREF _Toc241609566 \h </w:instrText>
+          <w:instrText xml:space="preserve"> PAGEREF _Toc241611345 \h </w:instrText>
         </w:r>
         <w:r>
           <w:rPr>
@@ -252,7 +252,7 @@
           <w:noProof/>
         </w:rPr>
       </w:pPr>
-      <w:hyperlink w:anchor="_Toc241609567" w:history="1">
+      <w:hyperlink w:anchor="_Toc241611346" w:history="1">
         <w:r>
           <w:rPr>
             <w:rStyle w:val="aff8"/>
@@ -280,7 +280,7 @@
             <w:noProof/>
             <w:webHidden/>
           </w:rPr>
-          <w:instrText xml:space="preserve"> PAGEREF _Toc241609567 \h </w:instrText>
+          <w:instrText xml:space="preserve"> PAGEREF _Toc241611346 \h </w:instrText>
         </w:r>
         <w:r>
           <w:rPr>
@@ -321,7 +321,7 @@
           <w:noProof/>
         </w:rPr>
       </w:pPr>
-      <w:hyperlink w:anchor="_Toc241609568" w:history="1">
+      <w:hyperlink w:anchor="_Toc241611347" w:history="1">
         <w:r>
           <w:rPr>
             <w:rStyle w:val="aff8"/>
@@ -349,7 +349,7 @@
             <w:noProof/>
             <w:webHidden/>
           </w:rPr>
-          <w:instrText xml:space="preserve"> PAGEREF _Toc241609568 \h </w:instrText>
+          <w:instrText xml:space="preserve"> PAGEREF _Toc241611347 \h </w:instrText>
         </w:r>
         <w:r>
           <w:rPr>
@@ -390,7 +390,7 @@
           <w:noProof/>
         </w:rPr>
       </w:pPr>
-      <w:hyperlink w:anchor="_Toc241609569" w:history="1">
+      <w:hyperlink w:anchor="_Toc241611348" w:history="1">
         <w:r>
           <w:rPr>
             <w:rStyle w:val="aff8"/>
@@ -418,7 +418,7 @@
             <w:noProof/>
             <w:webHidden/>
           </w:rPr>
-          <w:instrText xml:space="preserve"> PAGEREF _Toc241609569 \h </w:instrText>
+          <w:instrText xml:space="preserve"> PAGEREF _Toc241611348 \h </w:instrText>
         </w:r>
         <w:r>
           <w:rPr>
@@ -459,7 +459,7 @@
           <w:noProof/>
         </w:rPr>
       </w:pPr>
-      <w:hyperlink w:anchor="_Toc241609570" w:history="1">
+      <w:hyperlink w:anchor="_Toc241611349" w:history="1">
         <w:r>
           <w:rPr>
             <w:rStyle w:val="aff8"/>
@@ -487,7 +487,7 @@
             <w:noProof/>
             <w:webHidden/>
           </w:rPr>
-          <w:instrText xml:space="preserve"> PAGEREF _Toc241609570 \h </w:instrText>
+          <w:instrText xml:space="preserve"> PAGEREF _Toc241611349 \h </w:instrText>
         </w:r>
         <w:r>
           <w:rPr>
@@ -528,7 +528,7 @@
           <w:noProof/>
         </w:rPr>
       </w:pPr>
-      <w:hyperlink w:anchor="_Toc241609571" w:history="1">
+      <w:hyperlink w:anchor="_Toc241611350" w:history="1">
         <w:r>
           <w:rPr>
             <w:rStyle w:val="aff8"/>
@@ -556,7 +556,7 @@
             <w:noProof/>
             <w:webHidden/>
           </w:rPr>
-          <w:instrText xml:space="preserve"> PAGEREF _Toc241609571 \h </w:instrText>
+          <w:instrText xml:space="preserve"> PAGEREF _Toc241611350 \h </w:instrText>
         </w:r>
         <w:r>
           <w:rPr>
@@ -597,7 +597,7 @@
           <w:noProof/>
         </w:rPr>
       </w:pPr>
-      <w:hyperlink w:anchor="_Toc241609572" w:history="1">
+      <w:hyperlink w:anchor="_Toc241611351" w:history="1">
         <w:r>
           <w:rPr>
             <w:rStyle w:val="aff8"/>
@@ -625,7 +625,7 @@
             <w:noProof/>
             <w:webHidden/>
           </w:rPr>
-          <w:instrText xml:space="preserve"> PAGEREF _Toc241609572 \h </w:instrText>
+          <w:instrText xml:space="preserve"> PAGEREF _Toc241611351 \h </w:instrText>
         </w:r>
         <w:r>
           <w:rPr>
@@ -670,7 +670,7 @@
       <w:pPr>
         <w:pStyle w:val="1"/>
       </w:pPr>
-      <w:bookmarkStart w:id="0" w:name="_Toc241609566"/>
+      <w:bookmarkStart w:id="0" w:name="_Toc241611345"/>
       <w:r>
         <w:lastRenderedPageBreak/>
         <w:t>1. Цель и результаты</w:t>
@@ -951,7 +951,7 @@
       <w:pPr>
         <w:pStyle w:val="1"/>
       </w:pPr>
-      <w:bookmarkStart w:id="1" w:name="_Toc241609567"/>
+      <w:bookmarkStart w:id="1" w:name="_Toc241611346"/>
       <w:r>
         <w:t>2. Ход работы</w:t>
       </w:r>
@@ -1933,7 +1933,7 @@
               <w:rPr>
                 <w:sz w:val="20"/>
               </w:rPr>
-              <w:t>13 ошибок, основные — в разделе 6</w:t>
+              <w:t>14 ошибок, основные — в разделе 6</w:t>
             </w:r>
           </w:p>
         </w:tc>
@@ -2549,7 +2549,7 @@
       <w:pPr>
         <w:pStyle w:val="1"/>
       </w:pPr>
-      <w:bookmarkStart w:id="2" w:name="_Toc241609568"/>
+      <w:bookmarkStart w:id="2" w:name="_Toc241611347"/>
       <w:r>
         <w:t>3. Пайплайны</w:t>
       </w:r>
@@ -3474,7 +3474,7 @@
       <w:pPr>
         <w:pStyle w:val="1"/>
       </w:pPr>
-      <w:bookmarkStart w:id="3" w:name="_Toc241609569"/>
+      <w:bookmarkStart w:id="3" w:name="_Toc241611348"/>
       <w:r>
         <w:t>4. T5. Публикуемость и цитируемость</w:t>
       </w:r>
@@ -5053,7 +5053,7 @@
       <w:pPr>
         <w:pStyle w:val="1"/>
       </w:pPr>
-      <w:bookmarkStart w:id="4" w:name="_Toc241609570"/>
+      <w:bookmarkStart w:id="4" w:name="_Toc241611349"/>
       <w:r>
         <w:t>5. P2. Стресс-тест научного контента</w:t>
       </w:r>
@@ -5208,7 +5208,7 @@
               <w:rPr>
                 <w:sz w:val="20"/>
               </w:rPr>
-              <w:t>1,17</w:t>
+              <w:t>1,02</w:t>
             </w:r>
           </w:p>
         </w:tc>
@@ -5226,7 +5226,7 @@
               <w:rPr>
                 <w:sz w:val="20"/>
               </w:rPr>
-              <w:t>2,41</w:t>
+              <w:t>2,42</w:t>
             </w:r>
           </w:p>
         </w:tc>
@@ -5266,7 +5266,7 @@
               <w:rPr>
                 <w:sz w:val="20"/>
               </w:rPr>
-              <w:t>0,98</w:t>
+              <w:t>1,02</w:t>
             </w:r>
           </w:p>
         </w:tc>
@@ -5284,7 +5284,7 @@
               <w:rPr>
                 <w:sz w:val="20"/>
               </w:rPr>
-              <w:t>1,93</w:t>
+              <w:t>1,99</w:t>
             </w:r>
           </w:p>
         </w:tc>
@@ -5324,7 +5324,7 @@
               <w:rPr>
                 <w:sz w:val="20"/>
               </w:rPr>
-              <w:t>7 382</w:t>
+              <w:t>7 530</w:t>
             </w:r>
           </w:p>
         </w:tc>
@@ -5342,7 +5342,7 @@
               <w:rPr>
                 <w:sz w:val="20"/>
               </w:rPr>
-              <w:t>7 031</w:t>
+              <w:t>7 177</w:t>
             </w:r>
           </w:p>
         </w:tc>
@@ -5777,10 +5777,52 @@
         <w:t xml:space="preserve">Вес </w:t>
       </w:r>
       <w:r>
-        <w:t>страницы определяют библиотеки, а не генератор: Plotly.js — 64 %, MathJax — 28 %; тот же график в PNG весит 69 КиБ. Lighthouse запущен в CI (PageSpeed API без ключа исчерпал квоту); разброс между прогонами велик (Sphinx mobile: 71 и 51), нужна медиана неск</w:t>
-      </w:r>
-      <w:r>
-        <w:t>ольких прогонов.</w:t>
+        <w:t>страницы определяют библиотеки, а не генератор: Plotly.js — 63–66 %, MathJax — 27–29 %; тот же график в PNG весит 69 КиБ. Lighthouse запущен в CI (PageSpeed API без ключа исчерпал квоту); разброс между прогонами велик (Sphinx mobile: 71 и 51), нужна медиан</w:t>
+      </w:r>
+      <w:r>
+        <w:t>а нескольких прогонов.</w:t>
+      </w:r>
+    </w:p>
+    <w:p>
+      <w:pPr>
+        <w:ind w:firstLine="567"/>
+        <w:jc w:val="both"/>
+      </w:pPr>
+      <w:r>
+        <w:rPr>
+          <w:b/>
+        </w:rPr>
+        <w:t>Оформление.</w:t>
+      </w:r>
+      <w:r>
+        <w:t xml:space="preserve"> Стандартный вид тем заменён собственным без форка: палитра «подсолнух + малина» (тёмная тема — фиолетово-графитовая), шрифты Golos Text и Unbounded с кириллицей, лежат в самом сайте (139 КиБ). В MkDocs — </w:t>
+      </w:r>
+      <w:r>
+        <w:rPr>
+          <w:rFonts w:ascii="Consolas" w:eastAsia="Consolas" w:hAnsi="Consolas"/>
+          <w:sz w:val="21"/>
+        </w:rPr>
+        <w:t>primary/accent: c</w:t>
+      </w:r>
+      <w:r>
+        <w:rPr>
+          <w:rFonts w:ascii="Consolas" w:eastAsia="Consolas" w:hAnsi="Consolas"/>
+          <w:sz w:val="21"/>
+        </w:rPr>
+        <w:t>ustom</w:t>
+      </w:r>
+      <w:r>
+        <w:t xml:space="preserve"> и переопределение CSS-переменных Material, в Sphinx — </w:t>
+      </w:r>
+      <w:r>
+        <w:rPr>
+          <w:rFonts w:ascii="Consolas" w:eastAsia="Consolas" w:hAnsi="Consolas"/>
+          <w:sz w:val="21"/>
+        </w:rPr>
+        <w:t>html_theme_options</w:t>
+      </w:r>
+      <w:r>
+        <w:t xml:space="preserve"> Furo.</w:t>
       </w:r>
     </w:p>
     <w:p>
@@ -5804,9 +5846,9 @@
         <w:tblLook w:val="04A0" w:firstRow="1" w:lastRow="0" w:firstColumn="1" w:lastColumn="0" w:noHBand="0" w:noVBand="1"/>
       </w:tblPr>
       <w:tblGrid>
-        <w:gridCol w:w="2171"/>
-        <w:gridCol w:w="3854"/>
-        <w:gridCol w:w="3329"/>
+        <w:gridCol w:w="2144"/>
+        <w:gridCol w:w="3924"/>
+        <w:gridCol w:w="3287"/>
       </w:tblGrid>
       <w:tr>
         <w:trPr>
@@ -5815,7 +5857,7 @@
         </w:trPr>
         <w:tc>
           <w:tcPr>
-            <w:tcW w:w="2171" w:type="dxa"/>
+            <w:tcW w:w="2144" w:type="dxa"/>
             <w:shd w:val="clear" w:color="auto" w:fill="E8E8E4"/>
           </w:tcPr>
           <w:p>
@@ -5834,7 +5876,7 @@
         </w:tc>
         <w:tc>
           <w:tcPr>
-            <w:tcW w:w="3854" w:type="dxa"/>
+            <w:tcW w:w="3924" w:type="dxa"/>
             <w:shd w:val="clear" w:color="auto" w:fill="E8E8E4"/>
           </w:tcPr>
           <w:p>
@@ -5853,7 +5895,7 @@
         </w:tc>
         <w:tc>
           <w:tcPr>
-            <w:tcW w:w="3329" w:type="dxa"/>
+            <w:tcW w:w="3287" w:type="dxa"/>
             <w:shd w:val="clear" w:color="auto" w:fill="E8E8E4"/>
           </w:tcPr>
           <w:p>
@@ -5877,7 +5919,7 @@
         </w:trPr>
         <w:tc>
           <w:tcPr>
-            <w:tcW w:w="2171" w:type="dxa"/>
+            <w:tcW w:w="2144" w:type="dxa"/>
           </w:tcPr>
           <w:p>
             <w:pPr>
@@ -5894,7 +5936,7 @@
         </w:tc>
         <w:tc>
           <w:tcPr>
-            <w:tcW w:w="3854" w:type="dxa"/>
+            <w:tcW w:w="3924" w:type="dxa"/>
           </w:tcPr>
           <w:p>
             <w:pPr>
@@ -5911,7 +5953,7 @@
         </w:tc>
         <w:tc>
           <w:tcPr>
-            <w:tcW w:w="3329" w:type="dxa"/>
+            <w:tcW w:w="3287" w:type="dxa"/>
           </w:tcPr>
           <w:p>
             <w:pPr>
@@ -5933,7 +5975,7 @@
         </w:trPr>
         <w:tc>
           <w:tcPr>
-            <w:tcW w:w="2171" w:type="dxa"/>
+            <w:tcW w:w="2144" w:type="dxa"/>
           </w:tcPr>
           <w:p>
             <w:pPr>
@@ -5950,7 +5992,7 @@
         </w:tc>
         <w:tc>
           <w:tcPr>
-            <w:tcW w:w="3854" w:type="dxa"/>
+            <w:tcW w:w="3924" w:type="dxa"/>
           </w:tcPr>
           <w:p>
             <w:pPr>
@@ -5967,7 +6009,7 @@
         </w:tc>
         <w:tc>
           <w:tcPr>
-            <w:tcW w:w="3329" w:type="dxa"/>
+            <w:tcW w:w="3287" w:type="dxa"/>
           </w:tcPr>
           <w:p>
             <w:pPr>
@@ -5989,7 +6031,7 @@
         </w:trPr>
         <w:tc>
           <w:tcPr>
-            <w:tcW w:w="2171" w:type="dxa"/>
+            <w:tcW w:w="2144" w:type="dxa"/>
           </w:tcPr>
           <w:p>
             <w:pPr>
@@ -6000,36 +6042,30 @@
               <w:rPr>
                 <w:sz w:val="20"/>
               </w:rPr>
-              <w:t xml:space="preserve">Ссылка </w:t>
-            </w:r>
+              <w:t>Ссылка «Рисунок N»</w:t>
+            </w:r>
+          </w:p>
+        </w:tc>
+        <w:tc>
+          <w:tcPr>
+            <w:tcW w:w="3924" w:type="dxa"/>
+          </w:tcPr>
+          <w:p>
+            <w:pPr>
+              <w:keepNext/>
+              <w:spacing w:after="0" w:line="240" w:lineRule="auto"/>
+            </w:pPr>
             <w:r>
               <w:rPr>
                 <w:sz w:val="20"/>
               </w:rPr>
-              <w:t>«Рисунок N»</w:t>
-            </w:r>
-          </w:p>
-        </w:tc>
-        <w:tc>
-          <w:tcPr>
-            <w:tcW w:w="3854" w:type="dxa"/>
-          </w:tcPr>
-          <w:p>
-            <w:pPr>
-              <w:keepNext/>
-              <w:spacing w:after="0" w:line="240" w:lineRule="auto"/>
-            </w:pPr>
-            <w:r>
-              <w:rPr>
-                <w:sz w:val="20"/>
-              </w:rPr>
               <w:t>номер пишется вручную</w:t>
             </w:r>
           </w:p>
         </w:tc>
         <w:tc>
           <w:tcPr>
-            <w:tcW w:w="3329" w:type="dxa"/>
+            <w:tcW w:w="3287" w:type="dxa"/>
           </w:tcPr>
           <w:p>
             <w:pPr>
@@ -6052,7 +6088,7 @@
         </w:trPr>
         <w:tc>
           <w:tcPr>
-            <w:tcW w:w="2171" w:type="dxa"/>
+            <w:tcW w:w="2144" w:type="dxa"/>
           </w:tcPr>
           <w:p>
             <w:pPr>
@@ -6069,7 +6105,7 @@
         </w:tc>
         <w:tc>
           <w:tcPr>
-            <w:tcW w:w="3854" w:type="dxa"/>
+            <w:tcW w:w="3924" w:type="dxa"/>
           </w:tcPr>
           <w:p>
             <w:pPr>
@@ -6086,7 +6122,7 @@
         </w:tc>
         <w:tc>
           <w:tcPr>
-            <w:tcW w:w="3329" w:type="dxa"/>
+            <w:tcW w:w="3287" w:type="dxa"/>
           </w:tcPr>
           <w:p>
             <w:pPr>
@@ -6121,7 +6157,7 @@
         </w:trPr>
         <w:tc>
           <w:tcPr>
-            <w:tcW w:w="2171" w:type="dxa"/>
+            <w:tcW w:w="2144" w:type="dxa"/>
           </w:tcPr>
           <w:p>
             <w:pPr>
@@ -6138,7 +6174,7 @@
         </w:tc>
         <w:tc>
           <w:tcPr>
-            <w:tcW w:w="3854" w:type="dxa"/>
+            <w:tcW w:w="3924" w:type="dxa"/>
           </w:tcPr>
           <w:p>
             <w:pPr>
@@ -6155,7 +6191,7 @@
         </w:tc>
         <w:tc>
           <w:tcPr>
-            <w:tcW w:w="3329" w:type="dxa"/>
+            <w:tcW w:w="3287" w:type="dxa"/>
           </w:tcPr>
           <w:p>
             <w:pPr>
@@ -6166,7 +6202,13 @@
               <w:rPr>
                 <w:sz w:val="20"/>
               </w:rPr>
-              <w:t>«автор, год», отдельно от сносок</w:t>
+              <w:t xml:space="preserve">«автор, год», отдельно от </w:t>
+            </w:r>
+            <w:r>
+              <w:rPr>
+                <w:sz w:val="20"/>
+              </w:rPr>
+              <w:t>сносок</w:t>
             </w:r>
           </w:p>
         </w:tc>
@@ -6177,7 +6219,7 @@
         </w:trPr>
         <w:tc>
           <w:tcPr>
-            <w:tcW w:w="2171" w:type="dxa"/>
+            <w:tcW w:w="2144" w:type="dxa"/>
           </w:tcPr>
           <w:p>
             <w:pPr>
@@ -6194,7 +6236,7 @@
         </w:tc>
         <w:tc>
           <w:tcPr>
-            <w:tcW w:w="3854" w:type="dxa"/>
+            <w:tcW w:w="3924" w:type="dxa"/>
           </w:tcPr>
           <w:p>
             <w:pPr>
@@ -6211,7 +6253,7 @@
         </w:tc>
         <w:tc>
           <w:tcPr>
-            <w:tcW w:w="3329" w:type="dxa"/>
+            <w:tcW w:w="3287" w:type="dxa"/>
           </w:tcPr>
           <w:p>
             <w:pPr>
@@ -6240,7 +6282,7 @@
         </w:trPr>
         <w:tc>
           <w:tcPr>
-            <w:tcW w:w="2171" w:type="dxa"/>
+            <w:tcW w:w="2144" w:type="dxa"/>
           </w:tcPr>
           <w:p>
             <w:pPr>
@@ -6250,19 +6292,13 @@
               <w:rPr>
                 <w:sz w:val="20"/>
               </w:rPr>
-              <w:t xml:space="preserve">Без </w:t>
-            </w:r>
-            <w:r>
-              <w:rPr>
-                <w:sz w:val="20"/>
-              </w:rPr>
-              <w:t>внешних запросов</w:t>
-            </w:r>
-          </w:p>
-        </w:tc>
-        <w:tc>
-          <w:tcPr>
-            <w:tcW w:w="3854" w:type="dxa"/>
+              <w:t>Без внешних запросов</w:t>
+            </w:r>
+          </w:p>
+        </w:tc>
+        <w:tc>
+          <w:tcPr>
+            <w:tcW w:w="3924" w:type="dxa"/>
           </w:tcPr>
           <w:p>
             <w:pPr>
@@ -6279,13 +6315,13 @@
               <w:rPr>
                 <w:sz w:val="20"/>
               </w:rPr>
-              <w:t>, локальный MathJax, остаётся GitHub API</w:t>
-            </w:r>
-          </w:p>
-        </w:tc>
-        <w:tc>
-          <w:tcPr>
-            <w:tcW w:w="3329" w:type="dxa"/>
+              <w:t xml:space="preserve"> + свои шрифты, локальный MathJax, остаётся GitHub API</w:t>
+            </w:r>
+          </w:p>
+        </w:tc>
+        <w:tc>
+          <w:tcPr>
+            <w:tcW w:w="3287" w:type="dxa"/>
           </w:tcPr>
           <w:p>
             <w:pPr>
@@ -6295,7 +6331,7 @@
               <w:rPr>
                 <w:sz w:val="20"/>
               </w:rPr>
-              <w:t>локальный MathJax</w:t>
+              <w:t>локальные MathJax и шрифты</w:t>
             </w:r>
           </w:p>
         </w:tc>
@@ -6310,7 +6346,7 @@
       <w:pPr>
         <w:pStyle w:val="1"/>
       </w:pPr>
-      <w:bookmarkStart w:id="5" w:name="_Toc241609571"/>
+      <w:bookmarkStart w:id="5" w:name="_Toc241611350"/>
       <w:r>
         <w:t>6. Отладка</w:t>
       </w:r>
@@ -6328,7 +6364,10 @@
         <w:t>1. Формулы выводились сырым TeX.</w:t>
       </w:r>
       <w:r>
-        <w:t xml:space="preserve"> Гипотеза: MathJax не загрузился — отвергнута (</w:t>
+        <w:t xml:space="preserve"> Гипотеза: MathJax не загрузился — отв</w:t>
+      </w:r>
+      <w:r>
+        <w:t>ергнута (</w:t>
       </w:r>
       <w:r>
         <w:rPr>
@@ -6355,14 +6394,7 @@
           <w:rFonts w:ascii="Consolas" w:eastAsia="Consolas" w:hAnsi="Consolas"/>
           <w:sz w:val="21"/>
         </w:rPr>
-        <w:t>MathJax.config.tex.inli</w:t>
-      </w:r>
-      <w:r>
-        <w:rPr>
-          <w:rFonts w:ascii="Consolas" w:eastAsia="Consolas" w:hAnsi="Consolas"/>
-          <w:sz w:val="21"/>
-        </w:rPr>
-        <w:t>neMath</w:t>
+        <w:t>MathJax.config.tex.inlineMath</w:t>
       </w:r>
       <w:r>
         <w:t xml:space="preserve"> = </w:t>
@@ -6405,7 +6437,10 @@
         <w:t>measure.py</w:t>
       </w:r>
       <w:r>
-        <w:t xml:space="preserve"> добавлена проверка «0 формул без отрисовки».</w:t>
+        <w:t xml:space="preserve"> добавлена проверка «0 формул без отрисовки</w:t>
+      </w:r>
+      <w:r>
+        <w:t>».</w:t>
       </w:r>
     </w:p>
     <w:p>
@@ -6427,14 +6462,7 @@
           <w:rFonts w:ascii="Consolas" w:eastAsia="Consolas" w:hAnsi="Consolas"/>
           <w:sz w:val="21"/>
         </w:rPr>
-        <w:t>…contains a link '../report/t5.md#1-постоянные-ссылки-…',</w:t>
-      </w:r>
-      <w:r>
-        <w:rPr>
-          <w:rFonts w:ascii="Consolas" w:eastAsia="Consolas" w:hAnsi="Consolas"/>
-          <w:sz w:val="21"/>
-        </w:rPr>
-        <w:t xml:space="preserve"> but the doc does not contain an anchor</w:t>
+        <w:t>…contains a link '../report/t5.md#1-постоянные-ссылки-…', but the doc does not contain an anchor</w:t>
       </w:r>
       <w:r>
         <w:t xml:space="preserve">. Гипотеза: стандартный </w:t>
@@ -6467,7 +6495,10 @@
         <w:t>pymdownx.slugs.slugify(case=lower)</w:t>
       </w:r>
       <w:r>
-        <w:t xml:space="preserve"> — id совпали с MyST.</w:t>
+        <w:t xml:space="preserve"> —</w:t>
+      </w:r>
+      <w:r>
+        <w:t xml:space="preserve"> id совпали с MyST.</w:t>
       </w:r>
     </w:p>
     <w:p>
@@ -6492,10 +6523,7 @@
         <w:t>&lt;figure&gt;</w:t>
       </w:r>
       <w:r>
-        <w:t>» после</w:t>
-      </w:r>
-      <w:r>
-        <w:t xml:space="preserve"> замены на </w:t>
+        <w:t xml:space="preserve">» после замены на </w:t>
       </w:r>
       <w:r>
         <w:rPr>
@@ -6522,6 +6550,7 @@
           <w:rFonts w:ascii="Consolas" w:eastAsia="Consolas" w:hAnsi="Consolas"/>
           <w:sz w:val="21"/>
         </w:rPr>
+        <w:lastRenderedPageBreak/>
         <w:t>&lt;figure&gt;</w:t>
       </w:r>
       <w:r>
@@ -6532,7 +6561,14 @@
           <w:rFonts w:ascii="Consolas" w:eastAsia="Consolas" w:hAnsi="Consolas"/>
           <w:sz w:val="21"/>
         </w:rPr>
-        <w:t>.md-typeset figure:has(.plot-frame) { width: 100% }</w:t>
+        <w:t>.md-typeset figure:has(.plot-fr</w:t>
+      </w:r>
+      <w:r>
+        <w:rPr>
+          <w:rFonts w:ascii="Consolas" w:eastAsia="Consolas" w:hAnsi="Consolas"/>
+          <w:sz w:val="21"/>
+        </w:rPr>
+        <w:t>ame) { width: 100% }</w:t>
       </w:r>
       <w:r>
         <w:t>.</w:t>
@@ -6567,14 +6603,7 @@
           <w:rFonts w:ascii="Consolas" w:eastAsia="Consolas" w:hAnsi="Consolas"/>
           <w:sz w:val="21"/>
         </w:rPr>
-        <w:t>Failed to create deploy</w:t>
-      </w:r>
-      <w:r>
-        <w:rPr>
-          <w:rFonts w:ascii="Consolas" w:eastAsia="Consolas" w:hAnsi="Consolas"/>
-          <w:sz w:val="21"/>
-        </w:rPr>
-        <w:t>ment (status: 404) … Ensure GitHub Pages has been enabled</w:t>
+        <w:t>Failed to create deployment (status: 404) … Ensure GitHub Pages has been enabled</w:t>
       </w:r>
       <w:r>
         <w:t xml:space="preserve">; API: </w:t>
@@ -6587,11 +6616,7 @@
         <w:t>"has_pages": false</w:t>
       </w:r>
       <w:r>
-        <w:t xml:space="preserve"> → включён </w:t>
-      </w:r>
-      <w:r>
-        <w:lastRenderedPageBreak/>
-        <w:t xml:space="preserve">Pages. </w:t>
+        <w:t xml:space="preserve"> → включён Pages. </w:t>
       </w:r>
       <w:r>
         <w:rPr>
@@ -6633,13 +6658,7 @@
         <w:rPr>
           <w:b/>
         </w:rPr>
-        <w:t xml:space="preserve">5. Lighthouse: FCP 9,5 с у MkDocs (Sphinx — 1,0 </w:t>
-      </w:r>
-      <w:r>
-        <w:rPr>
-          <w:b/>
-        </w:rPr>
-        <w:t>с).</w:t>
+        <w:t>5. Lighthouse: FCP 9,5 с у MkDocs (Sphinx — 1,0 с).</w:t>
       </w:r>
       <w:r>
         <w:t xml:space="preserve"> Гипотеза: MathJax 2 МиБ подключён синхронно. Проверка HTML: у MkDocs </w:t>
@@ -6697,10 +6716,7 @@
         <w:t>6. Лимиты API.</w:t>
       </w:r>
       <w:r>
-        <w:t xml:space="preserve"> PageSpeed</w:t>
-      </w:r>
-      <w:r>
-        <w:t xml:space="preserve">: </w:t>
+        <w:t xml:space="preserve"> PageSpeed: </w:t>
       </w:r>
       <w:r>
         <w:rPr>
@@ -6730,14 +6746,17 @@
         <w:t>X-RateLimit-Remaining: 0</w:t>
       </w:r>
       <w:r>
-        <w:t>) от цикла ожидания CI. Решение: Lighthouse в CI, ожидание — по веб-странице Actions.</w:t>
+        <w:t>) от цикла ожидания CI.</w:t>
+      </w:r>
+      <w:r>
+        <w:t xml:space="preserve"> Решение: Lighthouse в CI, ожидание — по веб-странице Actions.</w:t>
       </w:r>
     </w:p>
     <w:p>
       <w:pPr>
         <w:pStyle w:val="1"/>
       </w:pPr>
-      <w:bookmarkStart w:id="6" w:name="_Toc241609572"/>
+      <w:bookmarkStart w:id="6" w:name="_Toc241611351"/>
       <w:r>
         <w:t>7. Вывод</w:t>
       </w:r>
@@ -6784,10 +6803,10 @@
         <w:t>sphinx-design</w:t>
       </w:r>
       <w:r>
-        <w:t>) — нумерация и ссылки на формулы, рисунки, таблицы при сборке, библиография «автор, год», ноль внешних запросов; скрипт «данные → графики → с</w:t>
-      </w:r>
-      <w:r>
-        <w:t xml:space="preserve">траница» перед сборкой; локальный MathJax; GitHub Actions с </w:t>
+        <w:t xml:space="preserve">) — нумерация и ссылки на формулы, рисунки, таблицы </w:t>
+      </w:r>
+      <w:r>
+        <w:t xml:space="preserve">при сборке, библиография «автор, год», ноль внешних запросов; скрипт «данные → графики → страница» перед сборкой; локальный MathJax; GitHub Actions с </w:t>
       </w:r>
       <w:r>
         <w:rPr>
@@ -6804,13 +6823,17 @@
           <w:rFonts w:ascii="Consolas" w:eastAsia="Consolas" w:hAnsi="Consolas"/>
           <w:sz w:val="21"/>
         </w:rPr>
-        <w:t>CITATION.cff</w:t>
-      </w:r>
-      <w:r>
-        <w:t xml:space="preserve">, раздельные лицензии. Графики — PNG, Plotly только там, где интерактивность нужна </w:t>
-      </w:r>
-      <w:r>
-        <w:t>для анализа.</w:t>
+        <w:t>CITAT</w:t>
+      </w:r>
+      <w:r>
+        <w:rPr>
+          <w:rFonts w:ascii="Consolas" w:eastAsia="Consolas" w:hAnsi="Consolas"/>
+          <w:sz w:val="21"/>
+        </w:rPr>
+        <w:t>ION.cff</w:t>
+      </w:r>
+      <w:r>
+        <w:t>, раздельные лицензии. Графики — PNG, Plotly только там, где интерактивность нужна для анализа.</w:t>
       </w:r>
     </w:p>
     <w:tbl>
@@ -6925,7 +6948,13 @@
               <w:rPr>
                 <w:sz w:val="20"/>
               </w:rPr>
-              <w:t>Нужна «публикация из коробки» (цитирование, ORCID, Highwire)</w:t>
+              <w:t>Нужна «публикация из коробки» (ц</w:t>
+            </w:r>
+            <w:r>
+              <w:rPr>
+                <w:sz w:val="20"/>
+              </w:rPr>
+              <w:t>итирование, ORCID, Highwire)</w:t>
             </w:r>
           </w:p>
         </w:tc>
@@ -6964,13 +6993,7 @@
               <w:rPr>
                 <w:sz w:val="20"/>
               </w:rPr>
-              <w:t>Документация кода, важны поиск и интерфейс, формул ма</w:t>
-            </w:r>
-            <w:r>
-              <w:rPr>
-                <w:sz w:val="20"/>
-              </w:rPr>
-              <w:t>ло</w:t>
+              <w:t>Документация кода, важны поиск и интерфейс, формул мало</w:t>
             </w:r>
           </w:p>
         </w:tc>
@@ -7065,7 +7088,13 @@
               <w:rPr>
                 <w:sz w:val="20"/>
               </w:rPr>
-              <w:t>та же сборка в GitVerse/SourceCraft, хостинг с доменом</w:t>
+              <w:t xml:space="preserve">та же сборка в </w:t>
+            </w:r>
+            <w:r>
+              <w:rPr>
+                <w:sz w:val="20"/>
+              </w:rPr>
+              <w:t>GitVerse/SourceCraft, хостинг с доменом</w:t>
             </w:r>
           </w:p>
         </w:tc>
@@ -18798,7 +18827,7 @@
     <w:autoRedefine/>
     <w:uiPriority w:val="39"/>
     <w:unhideWhenUsed/>
-    <w:rsid w:val="00C12050"/>
+    <w:rsid w:val="00E057EE"/>
     <w:pPr>
       <w:spacing w:after="100"/>
     </w:pPr>
@@ -18808,7 +18837,7 @@
     <w:basedOn w:val="a2"/>
     <w:uiPriority w:val="99"/>
     <w:unhideWhenUsed/>
-    <w:rsid w:val="00C12050"/>
+    <w:rsid w:val="00E057EE"/>
     <w:rPr>
       <w:color w:val="0000FF" w:themeColor="hyperlink"/>
       <w:u w:val="single"/>

</xml_diff>

<commit_message>
Report: Lighthouse medians after redesign, font CLS cost
</commit_message>
<xml_diff>
--- a/report/static_site_report.docx
+++ b/report/static_site_report.docx
@@ -183,7 +183,7 @@
       <w:r>
         <w:fldChar w:fldCharType="separate"/>
       </w:r>
-      <w:hyperlink w:anchor="_Toc241611345" w:history="1">
+      <w:hyperlink w:anchor="_Toc241612129" w:history="1">
         <w:r>
           <w:rPr>
             <w:rStyle w:val="aff8"/>
@@ -211,7 +211,7 @@
             <w:noProof/>
             <w:webHidden/>
           </w:rPr>
-          <w:instrText xml:space="preserve"> PAGEREF _Toc241611345 \h </w:instrText>
+          <w:instrText xml:space="preserve"> PAGEREF _Toc241612129 \h </w:instrText>
         </w:r>
         <w:r>
           <w:rPr>
@@ -252,7 +252,7 @@
           <w:noProof/>
         </w:rPr>
       </w:pPr>
-      <w:hyperlink w:anchor="_Toc241611346" w:history="1">
+      <w:hyperlink w:anchor="_Toc241612130" w:history="1">
         <w:r>
           <w:rPr>
             <w:rStyle w:val="aff8"/>
@@ -280,7 +280,7 @@
             <w:noProof/>
             <w:webHidden/>
           </w:rPr>
-          <w:instrText xml:space="preserve"> PAGEREF _Toc241611346 \h </w:instrText>
+          <w:instrText xml:space="preserve"> PAGEREF _Toc241612130 \h </w:instrText>
         </w:r>
         <w:r>
           <w:rPr>
@@ -321,7 +321,7 @@
           <w:noProof/>
         </w:rPr>
       </w:pPr>
-      <w:hyperlink w:anchor="_Toc241611347" w:history="1">
+      <w:hyperlink w:anchor="_Toc241612131" w:history="1">
         <w:r>
           <w:rPr>
             <w:rStyle w:val="aff8"/>
@@ -349,7 +349,7 @@
             <w:noProof/>
             <w:webHidden/>
           </w:rPr>
-          <w:instrText xml:space="preserve"> PAGEREF _Toc241611347 \h </w:instrText>
+          <w:instrText xml:space="preserve"> PAGEREF _Toc241612131 \h </w:instrText>
         </w:r>
         <w:r>
           <w:rPr>
@@ -390,7 +390,7 @@
           <w:noProof/>
         </w:rPr>
       </w:pPr>
-      <w:hyperlink w:anchor="_Toc241611348" w:history="1">
+      <w:hyperlink w:anchor="_Toc241612132" w:history="1">
         <w:r>
           <w:rPr>
             <w:rStyle w:val="aff8"/>
@@ -418,7 +418,7 @@
             <w:noProof/>
             <w:webHidden/>
           </w:rPr>
-          <w:instrText xml:space="preserve"> PAGEREF _Toc241611348 \h </w:instrText>
+          <w:instrText xml:space="preserve"> PAGEREF _Toc241612132 \h </w:instrText>
         </w:r>
         <w:r>
           <w:rPr>
@@ -459,7 +459,7 @@
           <w:noProof/>
         </w:rPr>
       </w:pPr>
-      <w:hyperlink w:anchor="_Toc241611349" w:history="1">
+      <w:hyperlink w:anchor="_Toc241612133" w:history="1">
         <w:r>
           <w:rPr>
             <w:rStyle w:val="aff8"/>
@@ -487,7 +487,7 @@
             <w:noProof/>
             <w:webHidden/>
           </w:rPr>
-          <w:instrText xml:space="preserve"> PAGEREF _Toc241611349 \h </w:instrText>
+          <w:instrText xml:space="preserve"> PAGEREF _Toc241612133 \h </w:instrText>
         </w:r>
         <w:r>
           <w:rPr>
@@ -528,7 +528,7 @@
           <w:noProof/>
         </w:rPr>
       </w:pPr>
-      <w:hyperlink w:anchor="_Toc241611350" w:history="1">
+      <w:hyperlink w:anchor="_Toc241612134" w:history="1">
         <w:r>
           <w:rPr>
             <w:rStyle w:val="aff8"/>
@@ -556,7 +556,7 @@
             <w:noProof/>
             <w:webHidden/>
           </w:rPr>
-          <w:instrText xml:space="preserve"> PAGEREF _Toc241611350 \h </w:instrText>
+          <w:instrText xml:space="preserve"> PAGEREF _Toc241612134 \h </w:instrText>
         </w:r>
         <w:r>
           <w:rPr>
@@ -597,7 +597,7 @@
           <w:noProof/>
         </w:rPr>
       </w:pPr>
-      <w:hyperlink w:anchor="_Toc241611351" w:history="1">
+      <w:hyperlink w:anchor="_Toc241612135" w:history="1">
         <w:r>
           <w:rPr>
             <w:rStyle w:val="aff8"/>
@@ -625,7 +625,7 @@
             <w:noProof/>
             <w:webHidden/>
           </w:rPr>
-          <w:instrText xml:space="preserve"> PAGEREF _Toc241611351 \h </w:instrText>
+          <w:instrText xml:space="preserve"> PAGEREF _Toc241612135 \h </w:instrText>
         </w:r>
         <w:r>
           <w:rPr>
@@ -670,7 +670,7 @@
       <w:pPr>
         <w:pStyle w:val="1"/>
       </w:pPr>
-      <w:bookmarkStart w:id="0" w:name="_Toc241611345"/>
+      <w:bookmarkStart w:id="0" w:name="_Toc241612129"/>
       <w:r>
         <w:lastRenderedPageBreak/>
         <w:t>1. Цель и результаты</w:t>
@@ -951,7 +951,7 @@
       <w:pPr>
         <w:pStyle w:val="1"/>
       </w:pPr>
-      <w:bookmarkStart w:id="1" w:name="_Toc241611346"/>
+      <w:bookmarkStart w:id="1" w:name="_Toc241612130"/>
       <w:r>
         <w:t>2. Ход работы</w:t>
       </w:r>
@@ -2549,7 +2549,7 @@
       <w:pPr>
         <w:pStyle w:val="1"/>
       </w:pPr>
-      <w:bookmarkStart w:id="2" w:name="_Toc241611347"/>
+      <w:bookmarkStart w:id="2" w:name="_Toc241612131"/>
       <w:r>
         <w:t>3. Пайплайны</w:t>
       </w:r>
@@ -3474,7 +3474,7 @@
       <w:pPr>
         <w:pStyle w:val="1"/>
       </w:pPr>
-      <w:bookmarkStart w:id="3" w:name="_Toc241611348"/>
+      <w:bookmarkStart w:id="3" w:name="_Toc241612132"/>
       <w:r>
         <w:t>4. T5. Публикуемость и цитируемость</w:t>
       </w:r>
@@ -5053,7 +5053,7 @@
       <w:pPr>
         <w:pStyle w:val="1"/>
       </w:pPr>
-      <w:bookmarkStart w:id="4" w:name="_Toc241611349"/>
+      <w:bookmarkStart w:id="4" w:name="_Toc241612133"/>
       <w:r>
         <w:t>5. P2. Стресс-тест научного контента</w:t>
       </w:r>
@@ -5105,9 +5105,9 @@
         <w:tblLook w:val="04A0" w:firstRow="1" w:lastRow="0" w:firstColumn="1" w:lastColumn="0" w:noHBand="0" w:noVBand="1"/>
       </w:tblPr>
       <w:tblGrid>
-        <w:gridCol w:w="3922"/>
-        <w:gridCol w:w="3125"/>
-        <w:gridCol w:w="2308"/>
+        <w:gridCol w:w="4134"/>
+        <w:gridCol w:w="3118"/>
+        <w:gridCol w:w="2102"/>
       </w:tblGrid>
       <w:tr>
         <w:trPr>
@@ -5116,7 +5116,7 @@
         </w:trPr>
         <w:tc>
           <w:tcPr>
-            <w:tcW w:w="3922" w:type="dxa"/>
+            <w:tcW w:w="4134" w:type="dxa"/>
             <w:shd w:val="clear" w:color="auto" w:fill="E8E8E4"/>
           </w:tcPr>
           <w:p>
@@ -5136,7 +5136,7 @@
         </w:tc>
         <w:tc>
           <w:tcPr>
-            <w:tcW w:w="3125" w:type="dxa"/>
+            <w:tcW w:w="3118" w:type="dxa"/>
             <w:shd w:val="clear" w:color="auto" w:fill="E8E8E4"/>
           </w:tcPr>
           <w:p>
@@ -5155,7 +5155,7 @@
         </w:tc>
         <w:tc>
           <w:tcPr>
-            <w:tcW w:w="2308" w:type="dxa"/>
+            <w:tcW w:w="2102" w:type="dxa"/>
             <w:shd w:val="clear" w:color="auto" w:fill="E8E8E4"/>
           </w:tcPr>
           <w:p>
@@ -5179,7 +5179,7 @@
         </w:trPr>
         <w:tc>
           <w:tcPr>
-            <w:tcW w:w="3922" w:type="dxa"/>
+            <w:tcW w:w="4134" w:type="dxa"/>
           </w:tcPr>
           <w:p>
             <w:pPr>
@@ -5196,7 +5196,7 @@
         </w:tc>
         <w:tc>
           <w:tcPr>
-            <w:tcW w:w="3125" w:type="dxa"/>
+            <w:tcW w:w="3118" w:type="dxa"/>
           </w:tcPr>
           <w:p>
             <w:pPr>
@@ -5214,7 +5214,7 @@
         </w:tc>
         <w:tc>
           <w:tcPr>
-            <w:tcW w:w="2308" w:type="dxa"/>
+            <w:tcW w:w="2102" w:type="dxa"/>
           </w:tcPr>
           <w:p>
             <w:pPr>
@@ -5237,7 +5237,7 @@
         </w:trPr>
         <w:tc>
           <w:tcPr>
-            <w:tcW w:w="3922" w:type="dxa"/>
+            <w:tcW w:w="4134" w:type="dxa"/>
           </w:tcPr>
           <w:p>
             <w:pPr>
@@ -5254,7 +5254,7 @@
         </w:tc>
         <w:tc>
           <w:tcPr>
-            <w:tcW w:w="3125" w:type="dxa"/>
+            <w:tcW w:w="3118" w:type="dxa"/>
           </w:tcPr>
           <w:p>
             <w:pPr>
@@ -5272,7 +5272,7 @@
         </w:tc>
         <w:tc>
           <w:tcPr>
-            <w:tcW w:w="2308" w:type="dxa"/>
+            <w:tcW w:w="2102" w:type="dxa"/>
           </w:tcPr>
           <w:p>
             <w:pPr>
@@ -5295,7 +5295,7 @@
         </w:trPr>
         <w:tc>
           <w:tcPr>
-            <w:tcW w:w="3922" w:type="dxa"/>
+            <w:tcW w:w="4134" w:type="dxa"/>
           </w:tcPr>
           <w:p>
             <w:pPr>
@@ -5312,7 +5312,7 @@
         </w:tc>
         <w:tc>
           <w:tcPr>
-            <w:tcW w:w="3125" w:type="dxa"/>
+            <w:tcW w:w="3118" w:type="dxa"/>
           </w:tcPr>
           <w:p>
             <w:pPr>
@@ -5330,7 +5330,7 @@
         </w:tc>
         <w:tc>
           <w:tcPr>
-            <w:tcW w:w="2308" w:type="dxa"/>
+            <w:tcW w:w="2102" w:type="dxa"/>
           </w:tcPr>
           <w:p>
             <w:pPr>
@@ -5353,7 +5353,7 @@
         </w:trPr>
         <w:tc>
           <w:tcPr>
-            <w:tcW w:w="3922" w:type="dxa"/>
+            <w:tcW w:w="4134" w:type="dxa"/>
           </w:tcPr>
           <w:p>
             <w:pPr>
@@ -5370,7 +5370,7 @@
         </w:tc>
         <w:tc>
           <w:tcPr>
-            <w:tcW w:w="3125" w:type="dxa"/>
+            <w:tcW w:w="3118" w:type="dxa"/>
           </w:tcPr>
           <w:p>
             <w:pPr>
@@ -5388,7 +5388,7 @@
         </w:tc>
         <w:tc>
           <w:tcPr>
-            <w:tcW w:w="2308" w:type="dxa"/>
+            <w:tcW w:w="2102" w:type="dxa"/>
           </w:tcPr>
           <w:p>
             <w:pPr>
@@ -5411,7 +5411,7 @@
         </w:trPr>
         <w:tc>
           <w:tcPr>
-            <w:tcW w:w="3922" w:type="dxa"/>
+            <w:tcW w:w="4134" w:type="dxa"/>
           </w:tcPr>
           <w:p>
             <w:pPr>
@@ -5428,7 +5428,7 @@
         </w:tc>
         <w:tc>
           <w:tcPr>
-            <w:tcW w:w="3125" w:type="dxa"/>
+            <w:tcW w:w="3118" w:type="dxa"/>
           </w:tcPr>
           <w:p>
             <w:pPr>
@@ -5446,7 +5446,7 @@
         </w:tc>
         <w:tc>
           <w:tcPr>
-            <w:tcW w:w="2308" w:type="dxa"/>
+            <w:tcW w:w="2102" w:type="dxa"/>
           </w:tcPr>
           <w:p>
             <w:pPr>
@@ -5469,7 +5469,7 @@
         </w:trPr>
         <w:tc>
           <w:tcPr>
-            <w:tcW w:w="3922" w:type="dxa"/>
+            <w:tcW w:w="4134" w:type="dxa"/>
           </w:tcPr>
           <w:p>
             <w:pPr>
@@ -5486,7 +5486,7 @@
         </w:tc>
         <w:tc>
           <w:tcPr>
-            <w:tcW w:w="3125" w:type="dxa"/>
+            <w:tcW w:w="3118" w:type="dxa"/>
           </w:tcPr>
           <w:p>
             <w:pPr>
@@ -5516,7 +5516,7 @@
         </w:tc>
         <w:tc>
           <w:tcPr>
-            <w:tcW w:w="2308" w:type="dxa"/>
+            <w:tcW w:w="2102" w:type="dxa"/>
           </w:tcPr>
           <w:p>
             <w:pPr>
@@ -5539,7 +5539,7 @@
         </w:trPr>
         <w:tc>
           <w:tcPr>
-            <w:tcW w:w="3922" w:type="dxa"/>
+            <w:tcW w:w="4134" w:type="dxa"/>
           </w:tcPr>
           <w:p>
             <w:pPr>
@@ -5562,7 +5562,7 @@
         </w:tc>
         <w:tc>
           <w:tcPr>
-            <w:tcW w:w="3125" w:type="dxa"/>
+            <w:tcW w:w="3118" w:type="dxa"/>
           </w:tcPr>
           <w:p>
             <w:pPr>
@@ -5579,7 +5579,7 @@
         </w:tc>
         <w:tc>
           <w:tcPr>
-            <w:tcW w:w="2308" w:type="dxa"/>
+            <w:tcW w:w="2102" w:type="dxa"/>
           </w:tcPr>
           <w:p>
             <w:pPr>
@@ -5601,7 +5601,7 @@
         </w:trPr>
         <w:tc>
           <w:tcPr>
-            <w:tcW w:w="3922" w:type="dxa"/>
+            <w:tcW w:w="4134" w:type="dxa"/>
           </w:tcPr>
           <w:p>
             <w:pPr>
@@ -5618,7 +5618,7 @@
         </w:tc>
         <w:tc>
           <w:tcPr>
-            <w:tcW w:w="3125" w:type="dxa"/>
+            <w:tcW w:w="3118" w:type="dxa"/>
           </w:tcPr>
           <w:p>
             <w:pPr>
@@ -5635,7 +5635,7 @@
         </w:tc>
         <w:tc>
           <w:tcPr>
-            <w:tcW w:w="2308" w:type="dxa"/>
+            <w:tcW w:w="2102" w:type="dxa"/>
           </w:tcPr>
           <w:p>
             <w:pPr>
@@ -5657,7 +5657,7 @@
         </w:trPr>
         <w:tc>
           <w:tcPr>
-            <w:tcW w:w="3922" w:type="dxa"/>
+            <w:tcW w:w="4134" w:type="dxa"/>
           </w:tcPr>
           <w:p>
             <w:pPr>
@@ -5668,13 +5668,13 @@
               <w:rPr>
                 <w:sz w:val="20"/>
               </w:rPr>
-              <w:t>Lighthouse mobile: Performance, A11y, BP, SEO</w:t>
-            </w:r>
-          </w:p>
-        </w:tc>
-        <w:tc>
-          <w:tcPr>
-            <w:tcW w:w="3125" w:type="dxa"/>
+              <w:t>Lighthouse mobile, медиана 3 прогонов: Perf, A11y, BP, SEO</w:t>
+            </w:r>
+          </w:p>
+        </w:tc>
+        <w:tc>
+          <w:tcPr>
+            <w:tcW w:w="3118" w:type="dxa"/>
           </w:tcPr>
           <w:p>
             <w:pPr>
@@ -5686,24 +5686,25 @@
               <w:rPr>
                 <w:sz w:val="20"/>
               </w:rPr>
-              <w:t>42, 87, 96, 100</w:t>
-            </w:r>
-          </w:p>
-        </w:tc>
-        <w:tc>
-          <w:tcPr>
-            <w:tcW w:w="2308" w:type="dxa"/>
-          </w:tcPr>
-          <w:p>
-            <w:pPr>
-              <w:keepNext/>
-              <w:spacing w:after="0" w:line="240" w:lineRule="auto"/>
+              <w:t>67, 87, 96, 100</w:t>
+            </w:r>
+          </w:p>
+        </w:tc>
+        <w:tc>
+          <w:tcPr>
+            <w:tcW w:w="2102" w:type="dxa"/>
+          </w:tcPr>
+          <w:p>
+            <w:pPr>
+              <w:keepNext/>
+              <w:spacing w:after="0" w:line="240" w:lineRule="auto"/>
+              <w:jc w:val="right"/>
             </w:pPr>
             <w:r>
               <w:rPr>
                 <w:sz w:val="20"/>
               </w:rPr>
-              <w:t>51–71, 91, 96, 100</w:t>
+              <w:t>45, 91, 96, 100</w:t>
             </w:r>
           </w:p>
         </w:tc>
@@ -5714,7 +5715,7 @@
         </w:trPr>
         <w:tc>
           <w:tcPr>
-            <w:tcW w:w="3922" w:type="dxa"/>
+            <w:tcW w:w="4134" w:type="dxa"/>
           </w:tcPr>
           <w:p>
             <w:pPr>
@@ -5724,13 +5725,19 @@
               <w:rPr>
                 <w:sz w:val="20"/>
               </w:rPr>
-              <w:t>Lighthouse desktop: Performance</w:t>
-            </w:r>
-          </w:p>
-        </w:tc>
-        <w:tc>
-          <w:tcPr>
-            <w:tcW w:w="3125" w:type="dxa"/>
+              <w:t xml:space="preserve">Lighthouse desktop, медиана: </w:t>
+            </w:r>
+            <w:r>
+              <w:rPr>
+                <w:sz w:val="20"/>
+              </w:rPr>
+              <w:t>Performance</w:t>
+            </w:r>
+          </w:p>
+        </w:tc>
+        <w:tc>
+          <w:tcPr>
+            <w:tcW w:w="3118" w:type="dxa"/>
           </w:tcPr>
           <w:p>
             <w:pPr>
@@ -5741,23 +5748,24 @@
               <w:rPr>
                 <w:sz w:val="20"/>
               </w:rPr>
-              <w:t>90</w:t>
-            </w:r>
-          </w:p>
-        </w:tc>
-        <w:tc>
-          <w:tcPr>
-            <w:tcW w:w="2308" w:type="dxa"/>
-          </w:tcPr>
-          <w:p>
-            <w:pPr>
-              <w:spacing w:after="0" w:line="240" w:lineRule="auto"/>
+              <w:t>85</w:t>
+            </w:r>
+          </w:p>
+        </w:tc>
+        <w:tc>
+          <w:tcPr>
+            <w:tcW w:w="2102" w:type="dxa"/>
+          </w:tcPr>
+          <w:p>
+            <w:pPr>
+              <w:spacing w:after="0" w:line="240" w:lineRule="auto"/>
+              <w:jc w:val="right"/>
             </w:pPr>
             <w:r>
               <w:rPr>
                 <w:sz w:val="20"/>
               </w:rPr>
-              <w:t>80–83</w:t>
+              <w:t>76</w:t>
             </w:r>
           </w:p>
         </w:tc>
@@ -5774,13 +5782,10 @@
         <w:jc w:val="both"/>
       </w:pPr>
       <w:r>
-        <w:t xml:space="preserve">Вес </w:t>
-      </w:r>
-      <w:r>
-        <w:t>страницы определяют библиотеки, а не генератор: Plotly.js — 63–66 %, MathJax — 27–29 %; тот же график в PNG весит 69 КиБ. Lighthouse запущен в CI (PageSpeed API без ключа исчерпал квоту); разброс между прогонами велик (Sphinx mobile: 71 и 51), нужна медиан</w:t>
-      </w:r>
-      <w:r>
-        <w:t>а нескольких прогонов.</w:t>
+        <w:t>Вес страницы определяют библиотеки, а не генератор: Plotly.js — 63–66 %, MathJax — 27–29 %; тот же график в PNG весит 69 КиБ. Lighthouse запущен в CI (PageSpeed API без ключа исчерпал квоту), по 3 прогона на конфигурацию: одиночный прог</w:t>
+      </w:r>
+      <w:r>
+        <w:t>он на мобильном профиле «шумит» на 20–40 баллов. Собственные шрифты дали сдвиг макета CLS 0,10–0,14.</w:t>
       </w:r>
     </w:p>
     <w:p>
@@ -5795,21 +5800,17 @@
         <w:t>Оформление.</w:t>
       </w:r>
       <w:r>
-        <w:t xml:space="preserve"> Стандартный вид тем заменён собственным без форка: палитра «подсолнух + малина» (тёмная тема — фиолетово-графитовая), шрифты Golos Text и Unbounded с кириллицей, лежат в самом сайте (139 КиБ). В MkDocs — </w:t>
+        <w:t xml:space="preserve"> Стандартный вид тем заменён собственным без форка: палитра «подсолнух + малина» (тёмная тема — фиолетово-графитовая), шрифты Golos Text и Unbou</w:t>
+      </w:r>
+      <w:r>
+        <w:t xml:space="preserve">nded с кириллицей, лежат в самом сайте (139 КиБ). В MkDocs — </w:t>
       </w:r>
       <w:r>
         <w:rPr>
           <w:rFonts w:ascii="Consolas" w:eastAsia="Consolas" w:hAnsi="Consolas"/>
           <w:sz w:val="21"/>
         </w:rPr>
-        <w:t>primary/accent: c</w:t>
-      </w:r>
-      <w:r>
-        <w:rPr>
-          <w:rFonts w:ascii="Consolas" w:eastAsia="Consolas" w:hAnsi="Consolas"/>
-          <w:sz w:val="21"/>
-        </w:rPr>
-        <w:t>ustom</w:t>
+        <w:t>primary/accent: custom</w:t>
       </w:r>
       <w:r>
         <w:t xml:space="preserve"> и переопределение CSS-переменных Material, в Sphinx — </w:t>
@@ -5930,7 +5931,13 @@
               <w:rPr>
                 <w:sz w:val="20"/>
               </w:rPr>
-              <w:t>Нумерация формул</w:t>
+              <w:t xml:space="preserve">Нумерация </w:t>
+            </w:r>
+            <w:r>
+              <w:rPr>
+                <w:sz w:val="20"/>
+              </w:rPr>
+              <w:t>формул</w:t>
             </w:r>
           </w:p>
         </w:tc>
@@ -6202,13 +6209,7 @@
               <w:rPr>
                 <w:sz w:val="20"/>
               </w:rPr>
-              <w:t xml:space="preserve">«автор, год», отдельно от </w:t>
-            </w:r>
-            <w:r>
-              <w:rPr>
-                <w:sz w:val="20"/>
-              </w:rPr>
-              <w:t>сносок</w:t>
+              <w:t>«автор, год», отдельно от сносок</w:t>
             </w:r>
           </w:p>
         </w:tc>
@@ -6346,7 +6347,7 @@
       <w:pPr>
         <w:pStyle w:val="1"/>
       </w:pPr>
-      <w:bookmarkStart w:id="5" w:name="_Toc241611350"/>
+      <w:bookmarkStart w:id="5" w:name="_Toc241612134"/>
       <w:r>
         <w:t>6. Отладка</w:t>
       </w:r>
@@ -6364,10 +6365,7 @@
         <w:t>1. Формулы выводились сырым TeX.</w:t>
       </w:r>
       <w:r>
-        <w:t xml:space="preserve"> Гипотеза: MathJax не загрузился — отв</w:t>
-      </w:r>
-      <w:r>
-        <w:t>ергнута (</w:t>
+        <w:t xml:space="preserve"> Гипотеза: MathJax не загрузился — отвергнута (</w:t>
       </w:r>
       <w:r>
         <w:rPr>
@@ -6394,7 +6392,14 @@
           <w:rFonts w:ascii="Consolas" w:eastAsia="Consolas" w:hAnsi="Consolas"/>
           <w:sz w:val="21"/>
         </w:rPr>
-        <w:t>MathJax.config.tex.inlineMath</w:t>
+        <w:t>MathJax.config.tex.inlineMat</w:t>
+      </w:r>
+      <w:r>
+        <w:rPr>
+          <w:rFonts w:ascii="Consolas" w:eastAsia="Consolas" w:hAnsi="Consolas"/>
+          <w:sz w:val="21"/>
+        </w:rPr>
+        <w:t>h</w:t>
       </w:r>
       <w:r>
         <w:t xml:space="preserve"> = </w:t>
@@ -6437,10 +6442,7 @@
         <w:t>measure.py</w:t>
       </w:r>
       <w:r>
-        <w:t xml:space="preserve"> добавлена проверка «0 формул без отрисовки</w:t>
-      </w:r>
-      <w:r>
-        <w:t>».</w:t>
+        <w:t xml:space="preserve"> добавлена проверка «0 формул без отрисовки».</w:t>
       </w:r>
     </w:p>
     <w:p>
@@ -6462,7 +6464,14 @@
           <w:rFonts w:ascii="Consolas" w:eastAsia="Consolas" w:hAnsi="Consolas"/>
           <w:sz w:val="21"/>
         </w:rPr>
-        <w:t>…contains a link '../report/t5.md#1-постоянные-ссылки-…', but the doc does not contain an anchor</w:t>
+        <w:t xml:space="preserve">…contains a link '../report/t5.md#1-постоянные-ссылки-…', but </w:t>
+      </w:r>
+      <w:r>
+        <w:rPr>
+          <w:rFonts w:ascii="Consolas" w:eastAsia="Consolas" w:hAnsi="Consolas"/>
+          <w:sz w:val="21"/>
+        </w:rPr>
+        <w:t>the doc does not contain an anchor</w:t>
       </w:r>
       <w:r>
         <w:t xml:space="preserve">. Гипотеза: стандартный </w:t>
@@ -6495,10 +6504,7 @@
         <w:t>pymdownx.slugs.slugify(case=lower)</w:t>
       </w:r>
       <w:r>
-        <w:t xml:space="preserve"> —</w:t>
-      </w:r>
-      <w:r>
-        <w:t xml:space="preserve"> id совпали с MyST.</w:t>
+        <w:t xml:space="preserve"> — id совпали с MyST.</w:t>
       </w:r>
     </w:p>
     <w:p>
@@ -6510,6 +6516,7 @@
         <w:rPr>
           <w:b/>
         </w:rPr>
+        <w:lastRenderedPageBreak/>
         <w:t>3. Plotly шириной 480 из 882 px.</w:t>
       </w:r>
       <w:r>
@@ -6523,7 +6530,10 @@
         <w:t>&lt;figure&gt;</w:t>
       </w:r>
       <w:r>
-        <w:t xml:space="preserve">» после замены на </w:t>
+        <w:t>» после заме</w:t>
+      </w:r>
+      <w:r>
+        <w:t xml:space="preserve">ны на </w:t>
       </w:r>
       <w:r>
         <w:rPr>
@@ -6550,7 +6560,6 @@
           <w:rFonts w:ascii="Consolas" w:eastAsia="Consolas" w:hAnsi="Consolas"/>
           <w:sz w:val="21"/>
         </w:rPr>
-        <w:lastRenderedPageBreak/>
         <w:t>&lt;figure&gt;</w:t>
       </w:r>
       <w:r>
@@ -6561,14 +6570,7 @@
           <w:rFonts w:ascii="Consolas" w:eastAsia="Consolas" w:hAnsi="Consolas"/>
           <w:sz w:val="21"/>
         </w:rPr>
-        <w:t>.md-typeset figure:has(.plot-fr</w:t>
-      </w:r>
-      <w:r>
-        <w:rPr>
-          <w:rFonts w:ascii="Consolas" w:eastAsia="Consolas" w:hAnsi="Consolas"/>
-          <w:sz w:val="21"/>
-        </w:rPr>
-        <w:t>ame) { width: 100% }</w:t>
+        <w:t>.md-typeset figure:has(.plot-frame) { width: 100% }</w:t>
       </w:r>
       <w:r>
         <w:t>.</w:t>
@@ -6603,7 +6605,14 @@
           <w:rFonts w:ascii="Consolas" w:eastAsia="Consolas" w:hAnsi="Consolas"/>
           <w:sz w:val="21"/>
         </w:rPr>
-        <w:t>Failed to create deployment (status: 404) … Ensure GitHub Pages has been enabled</w:t>
+        <w:t xml:space="preserve">Failed to create </w:t>
+      </w:r>
+      <w:r>
+        <w:rPr>
+          <w:rFonts w:ascii="Consolas" w:eastAsia="Consolas" w:hAnsi="Consolas"/>
+          <w:sz w:val="21"/>
+        </w:rPr>
+        <w:t>deployment (status: 404) … Ensure GitHub Pages has been enabled</w:t>
       </w:r>
       <w:r>
         <w:t xml:space="preserve">; API: </w:t>
@@ -6658,7 +6667,13 @@
         <w:rPr>
           <w:b/>
         </w:rPr>
-        <w:t>5. Lighthouse: FCP 9,5 с у MkDocs (Sphinx — 1,0 с).</w:t>
+        <w:t>5. Lighthouse: FCP 9,5 с у MkDocs (Sphinx — 1,0</w:t>
+      </w:r>
+      <w:r>
+        <w:rPr>
+          <w:b/>
+        </w:rPr>
+        <w:t xml:space="preserve"> с).</w:t>
       </w:r>
       <w:r>
         <w:t xml:space="preserve"> Гипотеза: MathJax 2 МиБ подключён синхронно. Проверка HTML: у MkDocs </w:t>
@@ -6746,17 +6761,17 @@
         <w:t>X-RateLimit-Remaining: 0</w:t>
       </w:r>
       <w:r>
-        <w:t>) от цикла ожидания CI.</w:t>
-      </w:r>
-      <w:r>
-        <w:t xml:space="preserve"> Решение: Lighthouse в CI, ожидание — по веб-странице Actions.</w:t>
+        <w:t>) от цикла ожидания CI. Решение: Lighthouse в CI, ожи</w:t>
+      </w:r>
+      <w:r>
+        <w:t>дание — по веб-странице Actions.</w:t>
       </w:r>
     </w:p>
     <w:p>
       <w:pPr>
         <w:pStyle w:val="1"/>
       </w:pPr>
-      <w:bookmarkStart w:id="6" w:name="_Toc241611351"/>
+      <w:bookmarkStart w:id="6" w:name="_Toc241612135"/>
       <w:r>
         <w:t>7. Вывод</w:t>
       </w:r>
@@ -6803,10 +6818,10 @@
         <w:t>sphinx-design</w:t>
       </w:r>
       <w:r>
-        <w:t xml:space="preserve">) — нумерация и ссылки на формулы, рисунки, таблицы </w:t>
-      </w:r>
-      <w:r>
-        <w:t xml:space="preserve">при сборке, библиография «автор, год», ноль внешних запросов; скрипт «данные → графики → страница» перед сборкой; локальный MathJax; GitHub Actions с </w:t>
+        <w:t>) — нумерация и ссылки на формулы, рисунки, таблицы при сборке, библиография «авто</w:t>
+      </w:r>
+      <w:r>
+        <w:t xml:space="preserve">р, год», ноль внешних запросов; скрипт «данные → графики → страница» перед сборкой; локальный MathJax; GitHub Actions с </w:t>
       </w:r>
       <w:r>
         <w:rPr>
@@ -6823,17 +6838,13 @@
           <w:rFonts w:ascii="Consolas" w:eastAsia="Consolas" w:hAnsi="Consolas"/>
           <w:sz w:val="21"/>
         </w:rPr>
-        <w:t>CITAT</w:t>
-      </w:r>
-      <w:r>
-        <w:rPr>
-          <w:rFonts w:ascii="Consolas" w:eastAsia="Consolas" w:hAnsi="Consolas"/>
-          <w:sz w:val="21"/>
-        </w:rPr>
-        <w:t>ION.cff</w:t>
-      </w:r>
-      <w:r>
-        <w:t>, раздельные лицензии. Графики — PNG, Plotly только там, где интерактивность нужна для анализа.</w:t>
+        <w:t>CITATION.cff</w:t>
+      </w:r>
+      <w:r>
+        <w:t xml:space="preserve">, раздельные лицензии. </w:t>
+      </w:r>
+      <w:r>
+        <w:t>Графики — PNG, Plotly только там, где интерактивность нужна для анализа.</w:t>
       </w:r>
     </w:p>
     <w:tbl>
@@ -6948,30 +6959,30 @@
               <w:rPr>
                 <w:sz w:val="20"/>
               </w:rPr>
-              <w:t>Нужна «публикация из коробки» (ц</w:t>
-            </w:r>
+              <w:t>Нужна «публикация из коробки» (цитирование, ORCID, Highwire)</w:t>
+            </w:r>
+          </w:p>
+        </w:tc>
+        <w:tc>
+          <w:tcPr>
+            <w:tcW w:w="4554" w:type="dxa"/>
+          </w:tcPr>
+          <w:p>
+            <w:pPr>
+              <w:keepNext/>
+              <w:spacing w:after="0" w:line="240" w:lineRule="auto"/>
+            </w:pPr>
             <w:r>
               <w:rPr>
                 <w:sz w:val="20"/>
               </w:rPr>
-              <w:t>итирование, ORCID, Highwire)</w:t>
-            </w:r>
-          </w:p>
-        </w:tc>
-        <w:tc>
-          <w:tcPr>
-            <w:tcW w:w="4554" w:type="dxa"/>
-          </w:tcPr>
-          <w:p>
-            <w:pPr>
-              <w:keepNext/>
-              <w:spacing w:after="0" w:line="240" w:lineRule="auto"/>
-            </w:pPr>
+              <w:t>Q</w:t>
+            </w:r>
             <w:r>
               <w:rPr>
                 <w:sz w:val="20"/>
               </w:rPr>
-              <w:t>Quarto</w:t>
+              <w:t>uarto</w:t>
             </w:r>
           </w:p>
         </w:tc>
@@ -7088,13 +7099,7 @@
               <w:rPr>
                 <w:sz w:val="20"/>
               </w:rPr>
-              <w:t xml:space="preserve">та же сборка в </w:t>
-            </w:r>
-            <w:r>
-              <w:rPr>
-                <w:sz w:val="20"/>
-              </w:rPr>
-              <w:t>GitVerse/SourceCraft, хостинг с доменом</w:t>
+              <w:t>та же сборка в GitVerse/SourceCraft, хостинг с доменом</w:t>
             </w:r>
           </w:p>
         </w:tc>
@@ -7115,7 +7120,13 @@
               <w:rPr>
                 <w:sz w:val="20"/>
               </w:rPr>
-              <w:t>Результат должен цитироваться годами</w:t>
+              <w:t xml:space="preserve">Результат должен </w:t>
+            </w:r>
+            <w:r>
+              <w:rPr>
+                <w:sz w:val="20"/>
+              </w:rPr>
+              <w:t>цитироваться годами</w:t>
             </w:r>
           </w:p>
         </w:tc>
@@ -18827,7 +18838,7 @@
     <w:autoRedefine/>
     <w:uiPriority w:val="39"/>
     <w:unhideWhenUsed/>
-    <w:rsid w:val="00E057EE"/>
+    <w:rsid w:val="00315B03"/>
     <w:pPr>
       <w:spacing w:after="100"/>
     </w:pPr>
@@ -18837,7 +18848,7 @@
     <w:basedOn w:val="a2"/>
     <w:uiPriority w:val="99"/>
     <w:unhideWhenUsed/>
-    <w:rsid w:val="00E057EE"/>
+    <w:rsid w:val="00315B03"/>
     <w:rPr>
       <w:color w:val="0000FF" w:themeColor="hyperlink"/>
       <w:u w:val="single"/>

</xml_diff>